<commit_message>
Revise Guided Example 5 content (Adjacent Toy Cars Meeting Equal Speeds)
- Update problem statement (velocities/acceleration only; positions removed)
- Restructure GIVEN into Car 1 / Car 2 sub-groups
- Rework solution: per-car velocity equations, substitution, speed-vs-
  velocity note callout, and explicit Case 1 / Case 2 solving for t
- Add verification of Part (b) speed; update boxed answers and insight
- Other examples unchanged
</commit_message>
<xml_diff>
--- a/UAM Guided Examples.docx
+++ b/UAM Guided Examples.docx
@@ -4125,8 +4125,18 @@
                 <w:color w:val="333333"/>
                 <w:sz w:val="21"/>
               </w:rPr>
-              <w:t>Acceleration  a</w:t>
+              <w:t xml:space="preserve">Acceleration  </w:t>
             </w:r>
+            <m:oMath>
+              <m:r>
+                <w:rPr>
+                  <w:rFonts w:ascii="Cambria Math" w:hAnsi="Cambria Math"/>
+                  <w:color w:val="333333"/>
+                  <w:sz w:val="21"/>
+                </w:rPr>
+                <m:t xml:space="preserve">a</m:t>
+              </m:r>
+            </m:oMath>
           </w:p>
         </w:tc>
       </w:tr>
@@ -6059,8 +6069,18 @@
                 <w:color w:val="333333"/>
                 <w:sz w:val="21"/>
               </w:rPr>
-              <w:t>Time interval  t</w:t>
+              <w:t xml:space="preserve">Time interval  </w:t>
             </w:r>
+            <m:oMath>
+              <m:r>
+                <w:rPr>
+                  <w:rFonts w:ascii="Cambria Math" w:hAnsi="Cambria Math"/>
+                  <w:color w:val="333333"/>
+                  <w:sz w:val="21"/>
+                </w:rPr>
+                <m:t xml:space="preserve">t</m:t>
+              </m:r>
+            </m:oMath>
           </w:p>
           <w:p>
             <w:pPr>
@@ -6084,8 +6104,18 @@
                 <w:color w:val="333333"/>
                 <w:sz w:val="21"/>
               </w:rPr>
-              <w:t>Acceleration  a</w:t>
+              <w:t xml:space="preserve">Acceleration  </w:t>
             </w:r>
+            <m:oMath>
+              <m:r>
+                <w:rPr>
+                  <w:rFonts w:ascii="Cambria Math" w:hAnsi="Cambria Math"/>
+                  <w:color w:val="333333"/>
+                  <w:sz w:val="21"/>
+                </w:rPr>
+                <m:t xml:space="preserve">a</m:t>
+              </m:r>
+            </m:oMath>
           </w:p>
         </w:tc>
       </w:tr>
@@ -8118,7 +8148,7 @@
                 <w:color w:val="FFFFFF"/>
                 <w:sz w:val="30"/>
               </w:rPr>
-              <w:t>Adjacent Toy Cars Reaching Equal Speeds</w:t>
+              <w:t>Adjacent Toy Cars Meeting Equal Speeds</w:t>
             </w:r>
           </w:p>
         </w:tc>
@@ -8202,7 +8232,7 @@
                 <w:color w:val="222222"/>
                 <w:sz w:val="21"/>
               </w:rPr>
-              <w:t>At t = 0, one toy car rolls on a straight track with initial position 15.0 cm, initial velocity -3.50 cm/s, and constant acceleration 2.40 cm/s². At the same moment, a second car rolls on an adjacent track with initial position 10.0 cm, initial velocity +5.50 cm/s, and zero acceleration.  (a) At what time, if any, do the two cars have equal speeds?  (b) What is that speed?</w:t>
+              <w:t>At t = 0, one toy car is set rolling on a straight track with an initial velocity of -3.50 cm/s and a constant acceleration of 2.40 cm/s². At the same moment, another toy car is set rolling on an adjacent track with an initial velocity of +5.50 cm/s and zero acceleration.  (a) At what time, if any, do the two cars have equal speeds?  (b) What are their speeds at that time?</w:t>
             </w:r>
           </w:p>
         </w:tc>
@@ -8277,7 +8307,22 @@
           </w:p>
           <w:p>
             <w:pPr>
-              <w:spacing w:before="60" w:after="60" w:line="269" w:lineRule="auto"/>
+              <w:spacing w:before="60" w:after="20" w:line="264" w:lineRule="auto"/>
+            </w:pPr>
+            <w:r>
+              <w:rPr>
+                <w:rFonts w:ascii="Calibri" w:hAnsi="Calibri"/>
+                <w:b/>
+                <w:i w:val="0"/>
+                <w:color w:val="1F3A5F"/>
+                <w:sz w:val="20"/>
+              </w:rPr>
+              <w:t>Car 1:</w:t>
+            </w:r>
+          </w:p>
+          <w:p>
+            <w:pPr>
+              <w:spacing w:before="0" w:after="60" w:line="269" w:lineRule="auto"/>
             </w:pPr>
             <w:r>
               <w:rPr>
@@ -8339,7 +8384,7 @@
                 <w:color w:val="6B6B6B"/>
                 <w:sz w:val="19"/>
               </w:rPr>
-              <w:t xml:space="preserve">   Car 1 initial velocity</w:t>
+              <w:t xml:space="preserve">   initial velocity</w:t>
             </w:r>
           </w:p>
           <w:p>
@@ -8406,7 +8451,22 @@
                 <w:color w:val="6B6B6B"/>
                 <w:sz w:val="19"/>
               </w:rPr>
-              <w:t xml:space="preserve">   Car 1 acceleration</w:t>
+              <w:t xml:space="preserve">   acceleration</w:t>
+            </w:r>
+          </w:p>
+          <w:p>
+            <w:pPr>
+              <w:spacing w:before="80" w:after="20" w:line="264" w:lineRule="auto"/>
+            </w:pPr>
+            <w:r>
+              <w:rPr>
+                <w:rFonts w:ascii="Calibri" w:hAnsi="Calibri"/>
+                <w:b/>
+                <w:i w:val="0"/>
+                <w:color w:val="1F3A5F"/>
+                <w:sz w:val="20"/>
+              </w:rPr>
+              <w:t>Car 2:</w:t>
             </w:r>
           </w:p>
           <w:p>
@@ -8442,7 +8502,7 @@
                       <w:color w:val="1A1A1A"/>
                       <w:sz w:val="21"/>
                     </w:rPr>
-                    <m:t xml:space="preserve">2</m:t>
+                    <m:t xml:space="preserve">02</m:t>
                   </m:r>
                 </m:sub>
               </m:sSub>
@@ -8473,7 +8533,7 @@
                 <w:color w:val="6B6B6B"/>
                 <w:sz w:val="19"/>
               </w:rPr>
-              <w:t xml:space="preserve">   Car 2 (constant velocity)</w:t>
+              <w:t xml:space="preserve">   initial velocity</w:t>
             </w:r>
           </w:p>
           <w:p>
@@ -8490,15 +8550,47 @@
               </w:rPr>
               <w:t xml:space="preserve">•  </w:t>
             </w:r>
+            <m:oMath>
+              <m:sSub>
+                <m:e>
+                  <m:r>
+                    <w:rPr>
+                      <w:rFonts w:ascii="Cambria Math" w:hAnsi="Cambria Math"/>
+                      <w:color w:val="1A1A1A"/>
+                      <w:sz w:val="21"/>
+                    </w:rPr>
+                    <m:t xml:space="preserve">a</m:t>
+                  </m:r>
+                </m:e>
+                <m:sub>
+                  <m:r>
+                    <w:rPr>
+                      <w:rFonts w:ascii="Cambria Math" w:hAnsi="Cambria Math"/>
+                      <w:color w:val="1A1A1A"/>
+                      <w:sz w:val="21"/>
+                    </w:rPr>
+                    <m:t xml:space="preserve">2</m:t>
+                  </m:r>
+                </m:sub>
+              </m:sSub>
+              <m:r>
+                <w:rPr>
+                  <w:rFonts w:ascii="Cambria Math" w:hAnsi="Cambria Math"/>
+                  <w:color w:val="1A1A1A"/>
+                  <w:sz w:val="21"/>
+                </w:rPr>
+                <m:t xml:space="preserve"> = 0</m:t>
+              </m:r>
+            </m:oMath>
             <w:r>
               <w:rPr>
                 <w:rFonts w:ascii="Calibri" w:hAnsi="Calibri"/>
                 <w:b w:val="0"/>
-                <w:i w:val="0"/>
-                <w:color w:val="333333"/>
-                <w:sz w:val="21"/>
+                <w:i/>
+                <w:color w:val="6B6B6B"/>
+                <w:sz w:val="19"/>
               </w:rPr>
-              <w:t>Positions x₀₁ = 15.0 cm, x₀₂ = 10.0 cm are not needed for speed.</w:t>
+              <w:t xml:space="preserve">   constant velocity</w:t>
             </w:r>
           </w:p>
         </w:tc>
@@ -8560,7 +8652,27 @@
                 <w:color w:val="333333"/>
                 <w:sz w:val="21"/>
               </w:rPr>
-              <w:t>Time t when the speeds are equal</w:t>
+              <w:t xml:space="preserve">(a) Time </w:t>
+            </w:r>
+            <m:oMath>
+              <m:r>
+                <w:rPr>
+                  <w:rFonts w:ascii="Cambria Math" w:hAnsi="Cambria Math"/>
+                  <w:color w:val="333333"/>
+                  <w:sz w:val="21"/>
+                </w:rPr>
+                <m:t xml:space="preserve">t</m:t>
+              </m:r>
+            </m:oMath>
+            <w:r>
+              <w:rPr>
+                <w:rFonts w:ascii="Calibri" w:hAnsi="Calibri"/>
+                <w:b w:val="0"/>
+                <w:i w:val="0"/>
+                <w:color w:val="333333"/>
+                <w:sz w:val="21"/>
+              </w:rPr>
+              <w:t xml:space="preserve"> when the speeds of the two cars are equal.</w:t>
             </w:r>
           </w:p>
           <w:p>
@@ -8585,7 +8697,7 @@
                 <w:color w:val="333333"/>
                 <w:sz w:val="21"/>
               </w:rPr>
-              <w:t>The matched speed at that time</w:t>
+              <w:t>(b) The speed value at that specific time.</w:t>
             </w:r>
           </w:p>
         </w:tc>
@@ -8645,33 +8757,7 @@
           <w:color w:val="2B2B2B"/>
           <w:sz w:val="21"/>
         </w:rPr>
-        <w:t>Speed is the magnitude of velocity. Car 2 moves at a constant 5.50 cm/s, so we find when Car 1's speed equals 5.50 cm/s.</w:t>
-      </w:r>
-    </w:p>
-    <w:p>
-      <w:pPr>
-        <w:keepNext/>
-        <w:spacing w:before="100" w:after="60" w:line="276" w:lineRule="auto"/>
-      </w:pPr>
-      <w:r>
-        <w:rPr>
-          <w:rFonts w:ascii="Calibri" w:hAnsi="Calibri"/>
-          <w:b/>
-          <w:i w:val="0"/>
-          <w:color w:val="1F3A5F"/>
-          <w:sz w:val="21"/>
-        </w:rPr>
-        <w:t xml:space="preserve">Part (a).  </w:t>
-      </w:r>
-      <w:r>
-        <w:rPr>
-          <w:rFonts w:ascii="Calibri" w:hAnsi="Calibri"/>
-          <w:b w:val="0"/>
-          <w:i w:val="0"/>
-          <w:color w:val="2B2B2B"/>
-          <w:sz w:val="21"/>
-        </w:rPr>
-        <w:t>From Car 1's velocity equation, isolate t:</w:t>
+        <w:t>Write the general velocity equation for each car. We use the first kinematic equation:</w:t>
       </w:r>
     </w:p>
     <w:tbl>
@@ -8691,13 +8777,148 @@
         <w:tblInd w:w="320" w:type="dxa"/>
       </w:tblPr>
       <w:tblGrid>
-        <w:gridCol w:w="1140"/>
-        <w:gridCol w:w="8260"/>
+        <w:gridCol w:w="320"/>
+        <w:gridCol w:w="9080"/>
       </w:tblGrid>
       <w:tr>
         <w:tc>
           <w:tcPr>
-            <w:tcW w:w="1140" w:type="dxa"/>
+            <w:tcW w:w="320" w:type="dxa"/>
+            <w:tcMar>
+              <w:top w:w="16" w:type="dxa"/>
+              <w:bottom w:w="16" w:type="dxa"/>
+              <w:start w:w="20" w:type="dxa"/>
+              <w:end w:w="72" w:type="dxa"/>
+              <w:left w:w="20" w:type="dxa"/>
+              <w:right w:w="72" w:type="dxa"/>
+            </w:tcMar>
+          </w:tcPr>
+          <w:p>
+            <w:pPr>
+              <w:spacing w:after="0" w:before="0"/>
+            </w:pPr>
+            <m:oMathPara>
+              <m:oMathParaPr>
+                <m:jc m:val="right"/>
+              </m:oMathParaPr>
+              <m:oMath>
+                <m:r>
+                  <w:rPr>
+                    <w:rFonts w:ascii="Cambria Math" w:hAnsi="Cambria Math"/>
+                    <w:color w:val="1A1A1A"/>
+                    <w:sz w:val="22"/>
+                  </w:rPr>
+                  <m:t xml:space="preserve">v</m:t>
+                </m:r>
+              </m:oMath>
+            </m:oMathPara>
+          </w:p>
+        </w:tc>
+        <w:tc>
+          <w:tcPr>
+            <w:tcW w:w="9080" w:type="dxa"/>
+            <w:tcMar>
+              <w:top w:w="16" w:type="dxa"/>
+              <w:bottom w:w="16" w:type="dxa"/>
+              <w:start w:w="72" w:type="dxa"/>
+              <w:end w:w="20" w:type="dxa"/>
+              <w:left w:w="72" w:type="dxa"/>
+              <w:right w:w="20" w:type="dxa"/>
+            </w:tcMar>
+          </w:tcPr>
+          <w:p>
+            <w:pPr>
+              <w:spacing w:after="0" w:before="0"/>
+            </w:pPr>
+            <m:oMathPara>
+              <m:oMathParaPr>
+                <m:jc m:val="left"/>
+              </m:oMathParaPr>
+              <m:oMath>
+                <m:r>
+                  <w:rPr>
+                    <w:rFonts w:ascii="Cambria Math" w:hAnsi="Cambria Math"/>
+                    <w:color w:val="1A1A1A"/>
+                    <w:sz w:val="22"/>
+                  </w:rPr>
+                  <m:t xml:space="preserve">= </m:t>
+                </m:r>
+                <m:sSub>
+                  <m:e>
+                    <m:r>
+                      <w:rPr>
+                        <w:rFonts w:ascii="Cambria Math" w:hAnsi="Cambria Math"/>
+                        <w:color w:val="1A1A1A"/>
+                        <w:sz w:val="22"/>
+                      </w:rPr>
+                      <m:t xml:space="preserve">v</m:t>
+                    </m:r>
+                  </m:e>
+                  <m:sub>
+                    <m:r>
+                      <w:rPr>
+                        <w:rFonts w:ascii="Cambria Math" w:hAnsi="Cambria Math"/>
+                        <w:color w:val="1A1A1A"/>
+                        <w:sz w:val="22"/>
+                      </w:rPr>
+                      <m:t xml:space="preserve">0</m:t>
+                    </m:r>
+                  </m:sub>
+                </m:sSub>
+                <m:r>
+                  <w:rPr>
+                    <w:rFonts w:ascii="Cambria Math" w:hAnsi="Cambria Math"/>
+                    <w:color w:val="1A1A1A"/>
+                    <w:sz w:val="22"/>
+                  </w:rPr>
+                  <m:t xml:space="preserve"> + at</m:t>
+                </m:r>
+              </m:oMath>
+            </m:oMathPara>
+          </w:p>
+        </w:tc>
+      </w:tr>
+    </w:tbl>
+    <w:p>
+      <w:pPr>
+        <w:keepNext/>
+        <w:spacing w:before="100" w:after="60" w:line="276" w:lineRule="auto"/>
+      </w:pPr>
+      <w:r>
+        <w:rPr>
+          <w:rFonts w:ascii="Calibri" w:hAnsi="Calibri"/>
+          <w:b w:val="0"/>
+          <w:i w:val="0"/>
+          <w:color w:val="2B2B2B"/>
+          <w:sz w:val="21"/>
+        </w:rPr>
+        <w:t>Velocity of Car 1:</w:t>
+      </w:r>
+    </w:p>
+    <w:tbl>
+      <w:tblPr>
+        <w:jc w:val="left"/>
+        <w:tblLook w:firstColumn="1" w:firstRow="1" w:lastColumn="0" w:lastRow="0" w:noHBand="0" w:noVBand="1" w:val="04A0"/>
+        <w:tblW w:w="9400" w:type="dxa"/>
+        <w:tblLayout w:type="fixed"/>
+        <w:tblBorders>
+          <w:top w:val="nil"/>
+          <w:left w:val="nil"/>
+          <w:bottom w:val="nil"/>
+          <w:right w:val="nil"/>
+          <w:insideH w:val="nil"/>
+          <w:insideV w:val="nil"/>
+        </w:tblBorders>
+        <w:tblInd w:w="320" w:type="dxa"/>
+      </w:tblPr>
+      <w:tblGrid>
+        <w:gridCol w:w="420"/>
+        <w:gridCol w:w="8980"/>
+      </w:tblGrid>
+      <w:tr>
+        <w:tc>
+          <w:tcPr>
+            <w:tcW w:w="420" w:type="dxa"/>
             <w:tcMar>
               <w:top w:w="16" w:type="dxa"/>
               <w:bottom w:w="16" w:type="dxa"/>
@@ -8744,7 +8965,7 @@
         </w:tc>
         <w:tc>
           <w:tcPr>
-            <w:tcW w:w="8260" w:type="dxa"/>
+            <w:tcW w:w="8980" w:type="dxa"/>
             <w:tcMar>
               <w:top w:w="16" w:type="dxa"/>
               <w:bottom w:w="16" w:type="dxa"/>
@@ -8836,10 +9057,252 @@
           </w:p>
         </w:tc>
       </w:tr>
+    </w:tbl>
+    <w:p>
+      <w:pPr>
+        <w:keepNext/>
+        <w:spacing w:before="100" w:after="60" w:line="276" w:lineRule="auto"/>
+      </w:pPr>
+      <w:r>
+        <w:rPr>
+          <w:rFonts w:ascii="Calibri" w:hAnsi="Calibri"/>
+          <w:b w:val="0"/>
+          <w:i w:val="0"/>
+          <w:color w:val="2B2B2B"/>
+          <w:sz w:val="21"/>
+        </w:rPr>
+        <w:t>Velocity of Car 2:</w:t>
+      </w:r>
+    </w:p>
+    <w:tbl>
+      <w:tblPr>
+        <w:jc w:val="left"/>
+        <w:tblLook w:firstColumn="1" w:firstRow="1" w:lastColumn="0" w:lastRow="0" w:noHBand="0" w:noVBand="1" w:val="04A0"/>
+        <w:tblW w:w="9400" w:type="dxa"/>
+        <w:tblLayout w:type="fixed"/>
+        <w:tblBorders>
+          <w:top w:val="nil"/>
+          <w:left w:val="nil"/>
+          <w:bottom w:val="nil"/>
+          <w:right w:val="nil"/>
+          <w:insideH w:val="nil"/>
+          <w:insideV w:val="nil"/>
+        </w:tblBorders>
+        <w:tblInd w:w="320" w:type="dxa"/>
+      </w:tblPr>
+      <w:tblGrid>
+        <w:gridCol w:w="420"/>
+        <w:gridCol w:w="8980"/>
+      </w:tblGrid>
       <w:tr>
         <w:tc>
           <w:tcPr>
-            <w:tcW w:w="1140" w:type="dxa"/>
+            <w:tcW w:w="420" w:type="dxa"/>
+            <w:tcMar>
+              <w:top w:w="16" w:type="dxa"/>
+              <w:bottom w:w="16" w:type="dxa"/>
+              <w:start w:w="20" w:type="dxa"/>
+              <w:end w:w="72" w:type="dxa"/>
+              <w:left w:w="20" w:type="dxa"/>
+              <w:right w:w="72" w:type="dxa"/>
+            </w:tcMar>
+          </w:tcPr>
+          <w:p>
+            <w:pPr>
+              <w:spacing w:after="0" w:before="0"/>
+            </w:pPr>
+            <m:oMathPara>
+              <m:oMathParaPr>
+                <m:jc m:val="right"/>
+              </m:oMathParaPr>
+              <m:oMath>
+                <m:sSub>
+                  <m:e>
+                    <m:r>
+                      <w:rPr>
+                        <w:rFonts w:ascii="Cambria Math" w:hAnsi="Cambria Math"/>
+                        <w:color w:val="1A1A1A"/>
+                        <w:sz w:val="22"/>
+                      </w:rPr>
+                      <m:t xml:space="preserve">v</m:t>
+                    </m:r>
+                  </m:e>
+                  <m:sub>
+                    <m:r>
+                      <w:rPr>
+                        <w:rFonts w:ascii="Cambria Math" w:hAnsi="Cambria Math"/>
+                        <w:color w:val="1A1A1A"/>
+                        <w:sz w:val="22"/>
+                      </w:rPr>
+                      <m:t xml:space="preserve">2</m:t>
+                    </m:r>
+                  </m:sub>
+                </m:sSub>
+              </m:oMath>
+            </m:oMathPara>
+          </w:p>
+        </w:tc>
+        <w:tc>
+          <w:tcPr>
+            <w:tcW w:w="8980" w:type="dxa"/>
+            <w:tcMar>
+              <w:top w:w="16" w:type="dxa"/>
+              <w:bottom w:w="16" w:type="dxa"/>
+              <w:start w:w="72" w:type="dxa"/>
+              <w:end w:w="20" w:type="dxa"/>
+              <w:left w:w="72" w:type="dxa"/>
+              <w:right w:w="20" w:type="dxa"/>
+            </w:tcMar>
+          </w:tcPr>
+          <w:p>
+            <w:pPr>
+              <w:spacing w:after="0" w:before="0"/>
+            </w:pPr>
+            <m:oMathPara>
+              <m:oMathParaPr>
+                <m:jc m:val="left"/>
+              </m:oMathParaPr>
+              <m:oMath>
+                <m:r>
+                  <w:rPr>
+                    <w:rFonts w:ascii="Cambria Math" w:hAnsi="Cambria Math"/>
+                    <w:color w:val="1A1A1A"/>
+                    <w:sz w:val="22"/>
+                  </w:rPr>
+                  <m:t xml:space="preserve">= </m:t>
+                </m:r>
+                <m:sSub>
+                  <m:e>
+                    <m:r>
+                      <w:rPr>
+                        <w:rFonts w:ascii="Cambria Math" w:hAnsi="Cambria Math"/>
+                        <w:color w:val="1A1A1A"/>
+                        <w:sz w:val="22"/>
+                      </w:rPr>
+                      <m:t xml:space="preserve">v</m:t>
+                    </m:r>
+                  </m:e>
+                  <m:sub>
+                    <m:r>
+                      <w:rPr>
+                        <w:rFonts w:ascii="Cambria Math" w:hAnsi="Cambria Math"/>
+                        <w:color w:val="1A1A1A"/>
+                        <w:sz w:val="22"/>
+                      </w:rPr>
+                      <m:t xml:space="preserve">02</m:t>
+                    </m:r>
+                  </m:sub>
+                </m:sSub>
+                <m:r>
+                  <w:rPr>
+                    <w:rFonts w:ascii="Cambria Math" w:hAnsi="Cambria Math"/>
+                    <w:color w:val="1A1A1A"/>
+                    <w:sz w:val="22"/>
+                  </w:rPr>
+                  <m:t xml:space="preserve"> + </m:t>
+                </m:r>
+                <m:sSub>
+                  <m:e>
+                    <m:r>
+                      <w:rPr>
+                        <w:rFonts w:ascii="Cambria Math" w:hAnsi="Cambria Math"/>
+                        <w:color w:val="1A1A1A"/>
+                        <w:sz w:val="22"/>
+                      </w:rPr>
+                      <m:t xml:space="preserve">a</m:t>
+                    </m:r>
+                  </m:e>
+                  <m:sub>
+                    <m:r>
+                      <w:rPr>
+                        <w:rFonts w:ascii="Cambria Math" w:hAnsi="Cambria Math"/>
+                        <w:color w:val="1A1A1A"/>
+                        <w:sz w:val="22"/>
+                      </w:rPr>
+                      <m:t xml:space="preserve">2</m:t>
+                    </m:r>
+                  </m:sub>
+                </m:sSub>
+                <m:r>
+                  <w:rPr>
+                    <w:rFonts w:ascii="Cambria Math" w:hAnsi="Cambria Math"/>
+                    <w:color w:val="1A1A1A"/>
+                    <w:sz w:val="22"/>
+                  </w:rPr>
+                  <m:t xml:space="preserve">t</m:t>
+                </m:r>
+              </m:oMath>
+            </m:oMathPara>
+          </w:p>
+        </w:tc>
+      </w:tr>
+    </w:tbl>
+    <w:p>
+      <w:pPr>
+        <w:keepNext/>
+        <w:spacing w:before="100" w:after="60" w:line="276" w:lineRule="auto"/>
+      </w:pPr>
+      <w:r>
+        <w:rPr>
+          <w:rFonts w:ascii="Calibri" w:hAnsi="Calibri"/>
+          <w:b/>
+          <w:i w:val="0"/>
+          <w:color w:val="1F3A5F"/>
+          <w:sz w:val="21"/>
+        </w:rPr>
+        <w:t xml:space="preserve">Step 2.  </w:t>
+      </w:r>
+      <w:r>
+        <w:rPr>
+          <w:rFonts w:ascii="Calibri" w:hAnsi="Calibri"/>
+          <w:b w:val="0"/>
+          <w:i w:val="0"/>
+          <w:color w:val="2B2B2B"/>
+          <w:sz w:val="21"/>
+        </w:rPr>
+        <w:t>Substitute the given values into each equation.</w:t>
+      </w:r>
+    </w:p>
+    <w:p>
+      <w:pPr>
+        <w:keepNext/>
+        <w:spacing w:before="100" w:after="60" w:line="276" w:lineRule="auto"/>
+      </w:pPr>
+      <w:r>
+        <w:rPr>
+          <w:rFonts w:ascii="Calibri" w:hAnsi="Calibri"/>
+          <w:b/>
+          <w:i w:val="0"/>
+          <w:color w:val="1F3A5F"/>
+          <w:sz w:val="21"/>
+        </w:rPr>
+        <w:t xml:space="preserve">Car 1:  </w:t>
+      </w:r>
+    </w:p>
+    <w:tbl>
+      <w:tblPr>
+        <w:jc w:val="left"/>
+        <w:tblLook w:firstColumn="1" w:firstRow="1" w:lastColumn="0" w:lastRow="0" w:noHBand="0" w:noVBand="1" w:val="04A0"/>
+        <w:tblW w:w="9400" w:type="dxa"/>
+        <w:tblLayout w:type="fixed"/>
+        <w:tblBorders>
+          <w:top w:val="nil"/>
+          <w:left w:val="nil"/>
+          <w:bottom w:val="nil"/>
+          <w:right w:val="nil"/>
+          <w:insideH w:val="nil"/>
+          <w:insideV w:val="nil"/>
+        </w:tblBorders>
+        <w:tblInd w:w="320" w:type="dxa"/>
+      </w:tblPr>
+      <w:tblGrid>
+        <w:gridCol w:w="420"/>
+        <w:gridCol w:w="8980"/>
+      </w:tblGrid>
+      <w:tr>
+        <w:tc>
+          <w:tcPr>
+            <w:tcW w:w="420" w:type="dxa"/>
             <w:tcMar>
               <w:top w:w="16" w:type="dxa"/>
               <w:bottom w:w="16" w:type="dxa"/>
@@ -8880,43 +9343,13 @@
                     </m:r>
                   </m:sub>
                 </m:sSub>
-                <m:r>
-                  <w:rPr>
-                    <w:rFonts w:ascii="Cambria Math" w:hAnsi="Cambria Math"/>
-                    <w:color w:val="1A1A1A"/>
-                    <w:sz w:val="22"/>
-                  </w:rPr>
-                  <m:t xml:space="preserve"> - </m:t>
-                </m:r>
-                <m:sSub>
-                  <m:e>
-                    <m:r>
-                      <w:rPr>
-                        <w:rFonts w:ascii="Cambria Math" w:hAnsi="Cambria Math"/>
-                        <w:color w:val="1A1A1A"/>
-                        <w:sz w:val="22"/>
-                      </w:rPr>
-                      <m:t xml:space="preserve">v</m:t>
-                    </m:r>
-                  </m:e>
-                  <m:sub>
-                    <m:r>
-                      <w:rPr>
-                        <w:rFonts w:ascii="Cambria Math" w:hAnsi="Cambria Math"/>
-                        <w:color w:val="1A1A1A"/>
-                        <w:sz w:val="22"/>
-                      </w:rPr>
-                      <m:t xml:space="preserve">01</m:t>
-                    </m:r>
-                  </m:sub>
-                </m:sSub>
               </m:oMath>
             </m:oMathPara>
           </w:p>
         </w:tc>
         <w:tc>
           <w:tcPr>
-            <w:tcW w:w="8260" w:type="dxa"/>
+            <w:tcW w:w="8980" w:type="dxa"/>
             <w:tcMar>
               <w:top w:w="16" w:type="dxa"/>
               <w:bottom w:w="16" w:type="dxa"/>
@@ -8941,7 +9374,436 @@
                     <w:color w:val="1A1A1A"/>
                     <w:sz w:val="22"/>
                   </w:rPr>
-                  <m:t xml:space="preserve">= </m:t>
+                  <m:t xml:space="preserve">= -3.50 + 2.40t</m:t>
+                </m:r>
+              </m:oMath>
+            </m:oMathPara>
+          </w:p>
+        </w:tc>
+      </w:tr>
+    </w:tbl>
+    <w:p>
+      <w:pPr>
+        <w:keepNext/>
+        <w:spacing w:before="100" w:after="60" w:line="276" w:lineRule="auto"/>
+      </w:pPr>
+      <w:r>
+        <w:rPr>
+          <w:rFonts w:ascii="Calibri" w:hAnsi="Calibri"/>
+          <w:b/>
+          <w:i w:val="0"/>
+          <w:color w:val="1F3A5F"/>
+          <w:sz w:val="21"/>
+        </w:rPr>
+        <w:t xml:space="preserve">Car 2:  </w:t>
+      </w:r>
+    </w:p>
+    <w:tbl>
+      <w:tblPr>
+        <w:jc w:val="left"/>
+        <w:tblLook w:firstColumn="1" w:firstRow="1" w:lastColumn="0" w:lastRow="0" w:noHBand="0" w:noVBand="1" w:val="04A0"/>
+        <w:tblW w:w="9400" w:type="dxa"/>
+        <w:tblLayout w:type="fixed"/>
+        <w:tblBorders>
+          <w:top w:val="nil"/>
+          <w:left w:val="nil"/>
+          <w:bottom w:val="nil"/>
+          <w:right w:val="nil"/>
+          <w:insideH w:val="nil"/>
+          <w:insideV w:val="nil"/>
+        </w:tblBorders>
+        <w:tblInd w:w="320" w:type="dxa"/>
+      </w:tblPr>
+      <w:tblGrid>
+        <w:gridCol w:w="420"/>
+        <w:gridCol w:w="8980"/>
+      </w:tblGrid>
+      <w:tr>
+        <w:tc>
+          <w:tcPr>
+            <w:tcW w:w="420" w:type="dxa"/>
+            <w:tcMar>
+              <w:top w:w="16" w:type="dxa"/>
+              <w:bottom w:w="16" w:type="dxa"/>
+              <w:start w:w="20" w:type="dxa"/>
+              <w:end w:w="72" w:type="dxa"/>
+              <w:left w:w="20" w:type="dxa"/>
+              <w:right w:w="72" w:type="dxa"/>
+            </w:tcMar>
+          </w:tcPr>
+          <w:p>
+            <w:pPr>
+              <w:spacing w:after="0" w:before="0"/>
+            </w:pPr>
+            <m:oMathPara>
+              <m:oMathParaPr>
+                <m:jc m:val="right"/>
+              </m:oMathParaPr>
+              <m:oMath>
+                <m:sSub>
+                  <m:e>
+                    <m:r>
+                      <w:rPr>
+                        <w:rFonts w:ascii="Cambria Math" w:hAnsi="Cambria Math"/>
+                        <w:color w:val="1A1A1A"/>
+                        <w:sz w:val="22"/>
+                      </w:rPr>
+                      <m:t xml:space="preserve">v</m:t>
+                    </m:r>
+                  </m:e>
+                  <m:sub>
+                    <m:r>
+                      <w:rPr>
+                        <w:rFonts w:ascii="Cambria Math" w:hAnsi="Cambria Math"/>
+                        <w:color w:val="1A1A1A"/>
+                        <w:sz w:val="22"/>
+                      </w:rPr>
+                      <m:t xml:space="preserve">2</m:t>
+                    </m:r>
+                  </m:sub>
+                </m:sSub>
+              </m:oMath>
+            </m:oMathPara>
+          </w:p>
+        </w:tc>
+        <w:tc>
+          <w:tcPr>
+            <w:tcW w:w="8980" w:type="dxa"/>
+            <w:tcMar>
+              <w:top w:w="16" w:type="dxa"/>
+              <w:bottom w:w="16" w:type="dxa"/>
+              <w:start w:w="72" w:type="dxa"/>
+              <w:end w:w="20" w:type="dxa"/>
+              <w:left w:w="72" w:type="dxa"/>
+              <w:right w:w="20" w:type="dxa"/>
+            </w:tcMar>
+          </w:tcPr>
+          <w:p>
+            <w:pPr>
+              <w:spacing w:after="0" w:before="0"/>
+            </w:pPr>
+            <m:oMathPara>
+              <m:oMathParaPr>
+                <m:jc m:val="left"/>
+              </m:oMathParaPr>
+              <m:oMath>
+                <m:r>
+                  <w:rPr>
+                    <w:rFonts w:ascii="Cambria Math" w:hAnsi="Cambria Math"/>
+                    <w:color w:val="1A1A1A"/>
+                    <w:sz w:val="22"/>
+                  </w:rPr>
+                  <m:t xml:space="preserve">= 5.50 + (0)t</m:t>
+                </m:r>
+              </m:oMath>
+            </m:oMathPara>
+          </w:p>
+        </w:tc>
+      </w:tr>
+    </w:tbl>
+    <w:p>
+      <w:pPr>
+        <w:keepNext/>
+        <w:spacing w:before="100" w:after="60" w:line="276" w:lineRule="auto"/>
+      </w:pPr>
+      <w:r>
+        <w:rPr>
+          <w:rFonts w:ascii="Calibri" w:hAnsi="Calibri"/>
+          <w:b w:val="0"/>
+          <w:i w:val="0"/>
+          <w:color w:val="2B2B2B"/>
+          <w:sz w:val="21"/>
+        </w:rPr>
+        <w:t>Car 2 simplifies to:</w:t>
+      </w:r>
+    </w:p>
+    <w:tbl>
+      <w:tblPr>
+        <w:jc w:val="left"/>
+        <w:tblLook w:firstColumn="1" w:firstRow="1" w:lastColumn="0" w:lastRow="0" w:noHBand="0" w:noVBand="1" w:val="04A0"/>
+        <w:tblW w:w="9400" w:type="dxa"/>
+        <w:tblLayout w:type="fixed"/>
+        <w:tblBorders>
+          <w:top w:val="nil"/>
+          <w:left w:val="nil"/>
+          <w:bottom w:val="nil"/>
+          <w:right w:val="nil"/>
+          <w:insideH w:val="nil"/>
+          <w:insideV w:val="nil"/>
+        </w:tblBorders>
+        <w:tblInd w:w="320" w:type="dxa"/>
+      </w:tblPr>
+      <w:tblGrid>
+        <w:gridCol w:w="420"/>
+        <w:gridCol w:w="8980"/>
+      </w:tblGrid>
+      <w:tr>
+        <w:tc>
+          <w:tcPr>
+            <w:tcW w:w="420" w:type="dxa"/>
+            <w:tcMar>
+              <w:top w:w="16" w:type="dxa"/>
+              <w:bottom w:w="16" w:type="dxa"/>
+              <w:start w:w="20" w:type="dxa"/>
+              <w:end w:w="72" w:type="dxa"/>
+              <w:left w:w="20" w:type="dxa"/>
+              <w:right w:w="72" w:type="dxa"/>
+            </w:tcMar>
+          </w:tcPr>
+          <w:p>
+            <w:pPr>
+              <w:spacing w:after="0" w:before="0"/>
+            </w:pPr>
+            <m:oMathPara>
+              <m:oMathParaPr>
+                <m:jc m:val="right"/>
+              </m:oMathParaPr>
+              <m:oMath>
+                <m:sSub>
+                  <m:e>
+                    <m:r>
+                      <w:rPr>
+                        <w:rFonts w:ascii="Cambria Math" w:hAnsi="Cambria Math"/>
+                        <w:color w:val="1A1A1A"/>
+                        <w:sz w:val="22"/>
+                      </w:rPr>
+                      <m:t xml:space="preserve">v</m:t>
+                    </m:r>
+                  </m:e>
+                  <m:sub>
+                    <m:r>
+                      <w:rPr>
+                        <w:rFonts w:ascii="Cambria Math" w:hAnsi="Cambria Math"/>
+                        <w:color w:val="1A1A1A"/>
+                        <w:sz w:val="22"/>
+                      </w:rPr>
+                      <m:t xml:space="preserve">2</m:t>
+                    </m:r>
+                  </m:sub>
+                </m:sSub>
+              </m:oMath>
+            </m:oMathPara>
+          </w:p>
+        </w:tc>
+        <w:tc>
+          <w:tcPr>
+            <w:tcW w:w="8980" w:type="dxa"/>
+            <w:tcMar>
+              <w:top w:w="16" w:type="dxa"/>
+              <w:bottom w:w="16" w:type="dxa"/>
+              <w:start w:w="72" w:type="dxa"/>
+              <w:end w:w="20" w:type="dxa"/>
+              <w:left w:w="72" w:type="dxa"/>
+              <w:right w:w="20" w:type="dxa"/>
+            </w:tcMar>
+          </w:tcPr>
+          <w:p>
+            <w:pPr>
+              <w:spacing w:after="0" w:before="0"/>
+            </w:pPr>
+            <m:oMathPara>
+              <m:oMathParaPr>
+                <m:jc m:val="left"/>
+              </m:oMathParaPr>
+              <m:oMath>
+                <m:r>
+                  <w:rPr>
+                    <w:rFonts w:ascii="Cambria Math" w:hAnsi="Cambria Math"/>
+                    <w:color w:val="1A1A1A"/>
+                    <w:sz w:val="22"/>
+                  </w:rPr>
+                  <m:t xml:space="preserve">= 5.50</m:t>
+                </m:r>
+              </m:oMath>
+            </m:oMathPara>
+          </w:p>
+        </w:tc>
+      </w:tr>
+    </w:tbl>
+    <w:p>
+      <w:pPr>
+        <w:keepNext/>
+        <w:spacing w:before="100" w:after="60" w:line="276" w:lineRule="auto"/>
+      </w:pPr>
+      <w:r>
+        <w:rPr>
+          <w:rFonts w:ascii="Calibri" w:hAnsi="Calibri"/>
+          <w:b/>
+          <w:i w:val="0"/>
+          <w:color w:val="1F3A5F"/>
+          <w:sz w:val="21"/>
+        </w:rPr>
+        <w:t xml:space="preserve">Step 3.  </w:t>
+      </w:r>
+      <w:r>
+        <w:rPr>
+          <w:rFonts w:ascii="Calibri" w:hAnsi="Calibri"/>
+          <w:b w:val="0"/>
+          <w:i w:val="0"/>
+          <w:color w:val="2B2B2B"/>
+          <w:sz w:val="21"/>
+        </w:rPr>
+        <w:t>Relate velocity to speed and set the equations equal.</w:t>
+      </w:r>
+    </w:p>
+    <w:tbl>
+      <w:tblPr>
+        <w:jc w:val="center"/>
+        <w:tblLook w:firstColumn="1" w:firstRow="1" w:lastColumn="0" w:lastRow="0" w:noHBand="0" w:noVBand="1" w:val="04A0"/>
+        <w:tblW w:w="9720" w:type="dxa"/>
+        <w:tblLayout w:type="fixed"/>
+        <w:tblBorders>
+          <w:top w:val="nil"/>
+          <w:left w:val="nil"/>
+          <w:bottom w:val="nil"/>
+          <w:right w:val="nil"/>
+          <w:insideH w:val="nil"/>
+          <w:insideV w:val="nil"/>
+        </w:tblBorders>
+      </w:tblPr>
+      <w:tblGrid>
+        <w:gridCol w:w="9720"/>
+      </w:tblGrid>
+      <w:tr>
+        <w:tc>
+          <w:tcPr>
+            <w:tcW w:w="9720" w:type="dxa"/>
+            <w:shd w:val="clear" w:color="auto" w:fill="EAF3F1"/>
+            <w:tcBorders>
+              <w:top w:val="nil"/>
+              <w:left w:val="single" w:sz="18" w:space="0" w:color="0F766E"/>
+              <w:bottom w:val="nil"/>
+              <w:right w:val="nil"/>
+            </w:tcBorders>
+            <w:tcMar>
+              <w:top w:w="70" w:type="dxa"/>
+              <w:bottom w:w="70" w:type="dxa"/>
+              <w:start w:w="170" w:type="dxa"/>
+              <w:end w:w="170" w:type="dxa"/>
+              <w:left w:w="170" w:type="dxa"/>
+              <w:right w:w="170" w:type="dxa"/>
+            </w:tcMar>
+          </w:tcPr>
+          <w:p>
+            <w:pPr>
+              <w:spacing w:after="40"/>
+            </w:pPr>
+            <w:r>
+              <w:rPr>
+                <w:rFonts w:ascii="Calibri" w:hAnsi="Calibri"/>
+                <w:b/>
+                <w:i w:val="0"/>
+                <w:color w:val="0F766E"/>
+                <w:sz w:val="17"/>
+                <w:caps/>
+                <w:spacing w:val="30"/>
+              </w:rPr>
+              <w:t>NOTE FOR STUDENTS · SPEED vs. VELOCITY</w:t>
+            </w:r>
+          </w:p>
+          <w:p>
+            <w:pPr>
+              <w:spacing w:before="0" w:after="0" w:line="276" w:lineRule="auto"/>
+            </w:pPr>
+            <w:r>
+              <w:rPr>
+                <w:rFonts w:ascii="Calibri" w:hAnsi="Calibri"/>
+                <w:b w:val="0"/>
+                <w:i/>
+                <w:color w:val="3A3A3A"/>
+                <w:sz w:val="19"/>
+              </w:rPr>
+              <w:t xml:space="preserve">Velocity is a vector (it has a + or - direction), but speed is a scalar (only the magnitude). To turn velocity into speed we take the absolute value: </w:t>
+            </w:r>
+            <m:oMath>
+              <m:r>
+                <w:rPr>
+                  <w:rFonts w:ascii="Cambria Math" w:hAnsi="Cambria Math"/>
+                  <w:color w:val="3A3A3A"/>
+                  <w:sz w:val="19"/>
+                </w:rPr>
+                <m:t xml:space="preserve">Speed = |v|</m:t>
+              </m:r>
+            </m:oMath>
+            <w:r>
+              <w:rPr>
+                <w:rFonts w:ascii="Calibri" w:hAnsi="Calibri"/>
+                <w:b w:val="0"/>
+                <w:i/>
+                <w:color w:val="3A3A3A"/>
+                <w:sz w:val="19"/>
+              </w:rPr>
+              <w:t>.</w:t>
+            </w:r>
+          </w:p>
+        </w:tc>
+      </w:tr>
+    </w:tbl>
+    <w:p>
+      <w:pPr>
+        <w:keepNext/>
+        <w:spacing w:before="100" w:after="60" w:line="276" w:lineRule="auto"/>
+      </w:pPr>
+      <w:r>
+        <w:rPr>
+          <w:rFonts w:ascii="Calibri" w:hAnsi="Calibri"/>
+          <w:b w:val="0"/>
+          <w:i w:val="0"/>
+          <w:color w:val="2B2B2B"/>
+          <w:sz w:val="21"/>
+        </w:rPr>
+        <w:t>For the two cars to have equal speeds, the absolute values of their velocities must be equal:</w:t>
+      </w:r>
+    </w:p>
+    <w:tbl>
+      <w:tblPr>
+        <w:jc w:val="left"/>
+        <w:tblLook w:firstColumn="1" w:firstRow="1" w:lastColumn="0" w:lastRow="0" w:noHBand="0" w:noVBand="1" w:val="04A0"/>
+        <w:tblW w:w="9400" w:type="dxa"/>
+        <w:tblLayout w:type="fixed"/>
+        <w:tblBorders>
+          <w:top w:val="nil"/>
+          <w:left w:val="nil"/>
+          <w:bottom w:val="nil"/>
+          <w:right w:val="nil"/>
+          <w:insideH w:val="nil"/>
+          <w:insideV w:val="nil"/>
+        </w:tblBorders>
+        <w:tblInd w:w="320" w:type="dxa"/>
+      </w:tblPr>
+      <w:tblGrid>
+        <w:gridCol w:w="660"/>
+        <w:gridCol w:w="8740"/>
+      </w:tblGrid>
+      <w:tr>
+        <w:tc>
+          <w:tcPr>
+            <w:tcW w:w="660" w:type="dxa"/>
+            <w:tcMar>
+              <w:top w:w="16" w:type="dxa"/>
+              <w:bottom w:w="16" w:type="dxa"/>
+              <w:start w:w="20" w:type="dxa"/>
+              <w:end w:w="72" w:type="dxa"/>
+              <w:left w:w="20" w:type="dxa"/>
+              <w:right w:w="72" w:type="dxa"/>
+            </w:tcMar>
+          </w:tcPr>
+          <w:p>
+            <w:pPr>
+              <w:spacing w:after="0" w:before="0"/>
+            </w:pPr>
+            <m:oMathPara>
+              <m:oMathParaPr>
+                <m:jc m:val="right"/>
+              </m:oMathParaPr>
+              <m:oMath>
+                <m:r>
+                  <w:rPr>
+                    <w:rFonts w:ascii="Cambria Math" w:hAnsi="Cambria Math"/>
+                    <w:color w:val="1A1A1A"/>
+                    <w:sz w:val="22"/>
+                  </w:rPr>
+                  <m:t xml:space="preserve">|</m:t>
                 </m:r>
                 <m:sSub>
                   <m:e>
@@ -8951,7 +9813,7 @@
                         <w:color w:val="1A1A1A"/>
                         <w:sz w:val="22"/>
                       </w:rPr>
-                      <m:t xml:space="preserve">a</m:t>
+                      <m:t xml:space="preserve">v</m:t>
                     </m:r>
                   </m:e>
                   <m:sub>
@@ -8971,7 +9833,397 @@
                     <w:color w:val="1A1A1A"/>
                     <w:sz w:val="22"/>
                   </w:rPr>
-                  <m:t xml:space="preserve">t</m:t>
+                  <m:t xml:space="preserve">|</m:t>
+                </m:r>
+              </m:oMath>
+            </m:oMathPara>
+          </w:p>
+        </w:tc>
+        <w:tc>
+          <w:tcPr>
+            <w:tcW w:w="8740" w:type="dxa"/>
+            <w:tcMar>
+              <w:top w:w="16" w:type="dxa"/>
+              <w:bottom w:w="16" w:type="dxa"/>
+              <w:start w:w="72" w:type="dxa"/>
+              <w:end w:w="20" w:type="dxa"/>
+              <w:left w:w="72" w:type="dxa"/>
+              <w:right w:w="20" w:type="dxa"/>
+            </w:tcMar>
+          </w:tcPr>
+          <w:p>
+            <w:pPr>
+              <w:spacing w:after="0" w:before="0"/>
+            </w:pPr>
+            <m:oMathPara>
+              <m:oMathParaPr>
+                <m:jc m:val="left"/>
+              </m:oMathParaPr>
+              <m:oMath>
+                <m:r>
+                  <w:rPr>
+                    <w:rFonts w:ascii="Cambria Math" w:hAnsi="Cambria Math"/>
+                    <w:color w:val="1A1A1A"/>
+                    <w:sz w:val="22"/>
+                  </w:rPr>
+                  <m:t xml:space="preserve">= |</m:t>
+                </m:r>
+                <m:sSub>
+                  <m:e>
+                    <m:r>
+                      <w:rPr>
+                        <w:rFonts w:ascii="Cambria Math" w:hAnsi="Cambria Math"/>
+                        <w:color w:val="1A1A1A"/>
+                        <w:sz w:val="22"/>
+                      </w:rPr>
+                      <m:t xml:space="preserve">v</m:t>
+                    </m:r>
+                  </m:e>
+                  <m:sub>
+                    <m:r>
+                      <w:rPr>
+                        <w:rFonts w:ascii="Cambria Math" w:hAnsi="Cambria Math"/>
+                        <w:color w:val="1A1A1A"/>
+                        <w:sz w:val="22"/>
+                      </w:rPr>
+                      <m:t xml:space="preserve">2</m:t>
+                    </m:r>
+                  </m:sub>
+                </m:sSub>
+                <m:r>
+                  <w:rPr>
+                    <w:rFonts w:ascii="Cambria Math" w:hAnsi="Cambria Math"/>
+                    <w:color w:val="1A1A1A"/>
+                    <w:sz w:val="22"/>
+                  </w:rPr>
+                  <m:t xml:space="preserve">|</m:t>
+                </m:r>
+              </m:oMath>
+            </m:oMathPara>
+          </w:p>
+        </w:tc>
+      </w:tr>
+    </w:tbl>
+    <w:p>
+      <w:pPr>
+        <w:keepNext/>
+        <w:spacing w:before="100" w:after="60" w:line="276" w:lineRule="auto"/>
+      </w:pPr>
+      <w:r>
+        <w:rPr>
+          <w:rFonts w:ascii="Calibri" w:hAnsi="Calibri"/>
+          <w:b w:val="0"/>
+          <w:i w:val="0"/>
+          <w:color w:val="2B2B2B"/>
+          <w:sz w:val="21"/>
+        </w:rPr>
+        <w:t>Because Car 2's speed is always 5.50 cm/s, Car 1's speed must reach 5.50 cm/s. This gives two mathematical possibilities for Car 1's actual velocity:</w:t>
+      </w:r>
+    </w:p>
+    <w:p>
+      <w:pPr>
+        <w:keepNext/>
+        <w:spacing w:before="100" w:after="60" w:line="276" w:lineRule="auto"/>
+      </w:pPr>
+      <w:r>
+        <w:rPr>
+          <w:rFonts w:ascii="Calibri" w:hAnsi="Calibri"/>
+          <w:b/>
+          <w:i w:val="0"/>
+          <w:color w:val="1F3A5F"/>
+          <w:sz w:val="21"/>
+        </w:rPr>
+        <w:t xml:space="preserve">Case 1:  </w:t>
+      </w:r>
+      <w:r>
+        <w:rPr>
+          <w:rFonts w:ascii="Calibri" w:hAnsi="Calibri"/>
+          <w:b w:val="0"/>
+          <w:i w:val="0"/>
+          <w:color w:val="2B2B2B"/>
+          <w:sz w:val="21"/>
+        </w:rPr>
+        <w:t>Car 1 is moving in the positive direction (</w:t>
+      </w:r>
+      <m:oMath>
+        <m:sSub>
+          <m:e>
+            <m:r>
+              <w:rPr>
+                <w:rFonts w:ascii="Cambria Math" w:hAnsi="Cambria Math"/>
+                <w:color w:val="2B2B2B"/>
+                <w:sz w:val="21"/>
+              </w:rPr>
+              <m:t xml:space="preserve">v</m:t>
+            </m:r>
+          </m:e>
+          <m:sub>
+            <m:r>
+              <w:rPr>
+                <w:rFonts w:ascii="Cambria Math" w:hAnsi="Cambria Math"/>
+                <w:color w:val="2B2B2B"/>
+                <w:sz w:val="21"/>
+              </w:rPr>
+              <m:t xml:space="preserve">1</m:t>
+            </m:r>
+          </m:sub>
+        </m:sSub>
+        <m:r>
+          <w:rPr>
+            <w:rFonts w:ascii="Cambria Math" w:hAnsi="Cambria Math"/>
+            <w:color w:val="2B2B2B"/>
+            <w:sz w:val="21"/>
+          </w:rPr>
+          <m:t xml:space="preserve"> = </m:t>
+        </m:r>
+        <m:sSub>
+          <m:e>
+            <m:r>
+              <w:rPr>
+                <w:rFonts w:ascii="Cambria Math" w:hAnsi="Cambria Math"/>
+                <w:color w:val="2B2B2B"/>
+                <w:sz w:val="21"/>
+              </w:rPr>
+              <m:t xml:space="preserve">v</m:t>
+            </m:r>
+          </m:e>
+          <m:sub>
+            <m:r>
+              <w:rPr>
+                <w:rFonts w:ascii="Cambria Math" w:hAnsi="Cambria Math"/>
+                <w:color w:val="2B2B2B"/>
+                <w:sz w:val="21"/>
+              </w:rPr>
+              <m:t xml:space="preserve">2</m:t>
+            </m:r>
+          </m:sub>
+        </m:sSub>
+      </m:oMath>
+      <w:r>
+        <w:rPr>
+          <w:rFonts w:ascii="Calibri" w:hAnsi="Calibri"/>
+          <w:b w:val="0"/>
+          <w:i w:val="0"/>
+          <w:color w:val="2B2B2B"/>
+          <w:sz w:val="21"/>
+        </w:rPr>
+        <w:t>).</w:t>
+      </w:r>
+    </w:p>
+    <w:p>
+      <w:pPr>
+        <w:keepNext/>
+        <w:spacing w:before="100" w:after="60" w:line="276" w:lineRule="auto"/>
+      </w:pPr>
+      <w:r>
+        <w:rPr>
+          <w:rFonts w:ascii="Calibri" w:hAnsi="Calibri"/>
+          <w:b/>
+          <w:i w:val="0"/>
+          <w:color w:val="1F3A5F"/>
+          <w:sz w:val="21"/>
+        </w:rPr>
+        <w:t xml:space="preserve">Case 2:  </w:t>
+      </w:r>
+      <w:r>
+        <w:rPr>
+          <w:rFonts w:ascii="Calibri" w:hAnsi="Calibri"/>
+          <w:b w:val="0"/>
+          <w:i w:val="0"/>
+          <w:color w:val="2B2B2B"/>
+          <w:sz w:val="21"/>
+        </w:rPr>
+        <w:t>Car 1 is moving in the negative direction (</w:t>
+      </w:r>
+      <m:oMath>
+        <m:sSub>
+          <m:e>
+            <m:r>
+              <w:rPr>
+                <w:rFonts w:ascii="Cambria Math" w:hAnsi="Cambria Math"/>
+                <w:color w:val="2B2B2B"/>
+                <w:sz w:val="21"/>
+              </w:rPr>
+              <m:t xml:space="preserve">v</m:t>
+            </m:r>
+          </m:e>
+          <m:sub>
+            <m:r>
+              <w:rPr>
+                <w:rFonts w:ascii="Cambria Math" w:hAnsi="Cambria Math"/>
+                <w:color w:val="2B2B2B"/>
+                <w:sz w:val="21"/>
+              </w:rPr>
+              <m:t xml:space="preserve">1</m:t>
+            </m:r>
+          </m:sub>
+        </m:sSub>
+        <m:r>
+          <w:rPr>
+            <w:rFonts w:ascii="Cambria Math" w:hAnsi="Cambria Math"/>
+            <w:color w:val="2B2B2B"/>
+            <w:sz w:val="21"/>
+          </w:rPr>
+          <m:t xml:space="preserve"> = -</m:t>
+        </m:r>
+        <m:sSub>
+          <m:e>
+            <m:r>
+              <w:rPr>
+                <w:rFonts w:ascii="Cambria Math" w:hAnsi="Cambria Math"/>
+                <w:color w:val="2B2B2B"/>
+                <w:sz w:val="21"/>
+              </w:rPr>
+              <m:t xml:space="preserve">v</m:t>
+            </m:r>
+          </m:e>
+          <m:sub>
+            <m:r>
+              <w:rPr>
+                <w:rFonts w:ascii="Cambria Math" w:hAnsi="Cambria Math"/>
+                <w:color w:val="2B2B2B"/>
+                <w:sz w:val="21"/>
+              </w:rPr>
+              <m:t xml:space="preserve">2</m:t>
+            </m:r>
+          </m:sub>
+        </m:sSub>
+      </m:oMath>
+      <w:r>
+        <w:rPr>
+          <w:rFonts w:ascii="Calibri" w:hAnsi="Calibri"/>
+          <w:b w:val="0"/>
+          <w:i w:val="0"/>
+          <w:color w:val="2B2B2B"/>
+          <w:sz w:val="21"/>
+        </w:rPr>
+        <w:t>).</w:t>
+      </w:r>
+    </w:p>
+    <w:p>
+      <w:pPr>
+        <w:keepNext/>
+        <w:spacing w:before="100" w:after="60" w:line="276" w:lineRule="auto"/>
+      </w:pPr>
+      <w:r>
+        <w:rPr>
+          <w:rFonts w:ascii="Calibri" w:hAnsi="Calibri"/>
+          <w:b/>
+          <w:i w:val="0"/>
+          <w:color w:val="1F3A5F"/>
+          <w:sz w:val="21"/>
+        </w:rPr>
+        <w:t xml:space="preserve">Step 4.  </w:t>
+      </w:r>
+      <w:r>
+        <w:rPr>
+          <w:rFonts w:ascii="Calibri" w:hAnsi="Calibri"/>
+          <w:b w:val="0"/>
+          <w:i w:val="0"/>
+          <w:color w:val="2B2B2B"/>
+          <w:sz w:val="21"/>
+        </w:rPr>
+        <w:t>Solve for t in both cases.</w:t>
+      </w:r>
+    </w:p>
+    <w:p>
+      <w:pPr>
+        <w:keepNext/>
+        <w:spacing w:before="100" w:after="60" w:line="276" w:lineRule="auto"/>
+      </w:pPr>
+      <w:r>
+        <w:rPr>
+          <w:rFonts w:ascii="Calibri" w:hAnsi="Calibri"/>
+          <w:b w:val="0"/>
+          <w:i w:val="0"/>
+          <w:color w:val="2B2B2B"/>
+          <w:sz w:val="21"/>
+        </w:rPr>
+        <w:t>Solving Case 1 (velocities are exactly the same):</w:t>
+      </w:r>
+    </w:p>
+    <w:tbl>
+      <w:tblPr>
+        <w:jc w:val="left"/>
+        <w:tblLook w:firstColumn="1" w:firstRow="1" w:lastColumn="0" w:lastRow="0" w:noHBand="0" w:noVBand="1" w:val="04A0"/>
+        <w:tblW w:w="9400" w:type="dxa"/>
+        <w:tblLayout w:type="fixed"/>
+        <w:tblBorders>
+          <w:top w:val="nil"/>
+          <w:left w:val="nil"/>
+          <w:bottom w:val="nil"/>
+          <w:right w:val="nil"/>
+          <w:insideH w:val="nil"/>
+          <w:insideV w:val="nil"/>
+        </w:tblBorders>
+        <w:tblInd w:w="320" w:type="dxa"/>
+      </w:tblPr>
+      <w:tblGrid>
+        <w:gridCol w:w="1740"/>
+        <w:gridCol w:w="7660"/>
+      </w:tblGrid>
+      <w:tr>
+        <w:tc>
+          <w:tcPr>
+            <w:tcW w:w="1740" w:type="dxa"/>
+            <w:tcMar>
+              <w:top w:w="16" w:type="dxa"/>
+              <w:bottom w:w="16" w:type="dxa"/>
+              <w:start w:w="20" w:type="dxa"/>
+              <w:end w:w="72" w:type="dxa"/>
+              <w:left w:w="20" w:type="dxa"/>
+              <w:right w:w="72" w:type="dxa"/>
+            </w:tcMar>
+          </w:tcPr>
+          <w:p>
+            <w:pPr>
+              <w:spacing w:after="0" w:before="0"/>
+            </w:pPr>
+            <m:oMathPara>
+              <m:oMathParaPr>
+                <m:jc m:val="right"/>
+              </m:oMathParaPr>
+              <m:oMath>
+                <m:r>
+                  <w:rPr>
+                    <w:rFonts w:ascii="Cambria Math" w:hAnsi="Cambria Math"/>
+                    <w:color w:val="1A1A1A"/>
+                    <w:sz w:val="22"/>
+                  </w:rPr>
+                  <m:t xml:space="preserve">-3.50 + 2.40t</m:t>
+                </m:r>
+              </m:oMath>
+            </m:oMathPara>
+          </w:p>
+        </w:tc>
+        <w:tc>
+          <w:tcPr>
+            <w:tcW w:w="7660" w:type="dxa"/>
+            <w:tcMar>
+              <w:top w:w="16" w:type="dxa"/>
+              <w:bottom w:w="16" w:type="dxa"/>
+              <w:start w:w="72" w:type="dxa"/>
+              <w:end w:w="20" w:type="dxa"/>
+              <w:left w:w="72" w:type="dxa"/>
+              <w:right w:w="20" w:type="dxa"/>
+            </w:tcMar>
+          </w:tcPr>
+          <w:p>
+            <w:pPr>
+              <w:spacing w:after="0" w:before="0"/>
+            </w:pPr>
+            <m:oMathPara>
+              <m:oMathParaPr>
+                <m:jc m:val="left"/>
+              </m:oMathParaPr>
+              <m:oMath>
+                <m:r>
+                  <w:rPr>
+                    <w:rFonts w:ascii="Cambria Math" w:hAnsi="Cambria Math"/>
+                    <w:color w:val="1A1A1A"/>
+                    <w:sz w:val="22"/>
+                  </w:rPr>
+                  <m:t xml:space="preserve">= 5.50</m:t>
                 </m:r>
               </m:oMath>
             </m:oMathPara>
@@ -8981,7 +10233,143 @@
       <w:tr>
         <w:tc>
           <w:tcPr>
-            <w:tcW w:w="1140" w:type="dxa"/>
+            <w:tcW w:w="1740" w:type="dxa"/>
+            <w:tcMar>
+              <w:top w:w="16" w:type="dxa"/>
+              <w:bottom w:w="16" w:type="dxa"/>
+              <w:start w:w="20" w:type="dxa"/>
+              <w:end w:w="72" w:type="dxa"/>
+              <w:left w:w="20" w:type="dxa"/>
+              <w:right w:w="72" w:type="dxa"/>
+            </w:tcMar>
+          </w:tcPr>
+          <w:p>
+            <w:pPr>
+              <w:spacing w:after="0" w:before="0"/>
+            </w:pPr>
+            <m:oMathPara>
+              <m:oMathParaPr>
+                <m:jc m:val="right"/>
+              </m:oMathParaPr>
+              <m:oMath>
+                <m:r>
+                  <w:rPr>
+                    <w:rFonts w:ascii="Cambria Math" w:hAnsi="Cambria Math"/>
+                    <w:color w:val="1A1A1A"/>
+                    <w:sz w:val="22"/>
+                  </w:rPr>
+                  <m:t xml:space="preserve">2.40t</m:t>
+                </m:r>
+              </m:oMath>
+            </m:oMathPara>
+          </w:p>
+        </w:tc>
+        <w:tc>
+          <w:tcPr>
+            <w:tcW w:w="7660" w:type="dxa"/>
+            <w:tcMar>
+              <w:top w:w="16" w:type="dxa"/>
+              <w:bottom w:w="16" w:type="dxa"/>
+              <w:start w:w="72" w:type="dxa"/>
+              <w:end w:w="20" w:type="dxa"/>
+              <w:left w:w="72" w:type="dxa"/>
+              <w:right w:w="20" w:type="dxa"/>
+            </w:tcMar>
+          </w:tcPr>
+          <w:p>
+            <w:pPr>
+              <w:spacing w:after="0" w:before="0"/>
+            </w:pPr>
+            <m:oMathPara>
+              <m:oMathParaPr>
+                <m:jc m:val="left"/>
+              </m:oMathParaPr>
+              <m:oMath>
+                <m:r>
+                  <w:rPr>
+                    <w:rFonts w:ascii="Cambria Math" w:hAnsi="Cambria Math"/>
+                    <w:color w:val="1A1A1A"/>
+                    <w:sz w:val="22"/>
+                  </w:rPr>
+                  <m:t xml:space="preserve">= 5.50 + 3.50</m:t>
+                </m:r>
+              </m:oMath>
+            </m:oMathPara>
+          </w:p>
+        </w:tc>
+      </w:tr>
+      <w:tr>
+        <w:tc>
+          <w:tcPr>
+            <w:tcW w:w="1740" w:type="dxa"/>
+            <w:tcMar>
+              <w:top w:w="16" w:type="dxa"/>
+              <w:bottom w:w="16" w:type="dxa"/>
+              <w:start w:w="20" w:type="dxa"/>
+              <w:end w:w="72" w:type="dxa"/>
+              <w:left w:w="20" w:type="dxa"/>
+              <w:right w:w="72" w:type="dxa"/>
+            </w:tcMar>
+          </w:tcPr>
+          <w:p>
+            <w:pPr>
+              <w:spacing w:after="0" w:before="0"/>
+            </w:pPr>
+            <m:oMathPara>
+              <m:oMathParaPr>
+                <m:jc m:val="right"/>
+              </m:oMathParaPr>
+              <m:oMath>
+                <m:r>
+                  <w:rPr>
+                    <w:rFonts w:ascii="Cambria Math" w:hAnsi="Cambria Math"/>
+                    <w:color w:val="1A1A1A"/>
+                    <w:sz w:val="22"/>
+                  </w:rPr>
+                  <m:t xml:space="preserve">2.40t</m:t>
+                </m:r>
+              </m:oMath>
+            </m:oMathPara>
+          </w:p>
+        </w:tc>
+        <w:tc>
+          <w:tcPr>
+            <w:tcW w:w="7660" w:type="dxa"/>
+            <w:tcMar>
+              <w:top w:w="16" w:type="dxa"/>
+              <w:bottom w:w="16" w:type="dxa"/>
+              <w:start w:w="72" w:type="dxa"/>
+              <w:end w:w="20" w:type="dxa"/>
+              <w:left w:w="72" w:type="dxa"/>
+              <w:right w:w="20" w:type="dxa"/>
+            </w:tcMar>
+          </w:tcPr>
+          <w:p>
+            <w:pPr>
+              <w:spacing w:after="0" w:before="0"/>
+            </w:pPr>
+            <m:oMathPara>
+              <m:oMathParaPr>
+                <m:jc m:val="left"/>
+              </m:oMathParaPr>
+              <m:oMath>
+                <m:r>
+                  <w:rPr>
+                    <w:rFonts w:ascii="Cambria Math" w:hAnsi="Cambria Math"/>
+                    <w:color w:val="1A1A1A"/>
+                    <w:sz w:val="22"/>
+                  </w:rPr>
+                  <m:t xml:space="preserve">= 9.00</m:t>
+                </m:r>
+              </m:oMath>
+            </m:oMathPara>
+          </w:p>
+        </w:tc>
+      </w:tr>
+      <w:tr>
+        <w:tc>
+          <w:tcPr>
+            <w:tcW w:w="1740" w:type="dxa"/>
             <w:tcMar>
               <w:top w:w="16" w:type="dxa"/>
               <w:bottom w:w="16" w:type="dxa"/>
@@ -9014,277 +10402,7 @@
         </w:tc>
         <w:tc>
           <w:tcPr>
-            <w:tcW w:w="8260" w:type="dxa"/>
-            <w:tcMar>
-              <w:top w:w="16" w:type="dxa"/>
-              <w:bottom w:w="16" w:type="dxa"/>
-              <w:start w:w="72" w:type="dxa"/>
-              <w:end w:w="20" w:type="dxa"/>
-              <w:left w:w="72" w:type="dxa"/>
-              <w:right w:w="20" w:type="dxa"/>
-            </w:tcMar>
-          </w:tcPr>
-          <w:p>
-            <w:pPr>
-              <w:spacing w:after="0" w:before="0"/>
-            </w:pPr>
-            <m:oMathPara>
-              <m:oMathParaPr>
-                <m:jc m:val="left"/>
-              </m:oMathParaPr>
-              <m:oMath>
-                <m:r>
-                  <w:rPr>
-                    <w:rFonts w:ascii="Cambria Math" w:hAnsi="Cambria Math"/>
-                    <w:color w:val="1A1A1A"/>
-                    <w:sz w:val="22"/>
-                  </w:rPr>
-                  <m:t xml:space="preserve">= </m:t>
-                </m:r>
-                <m:f>
-                  <m:num>
-                    <m:sSub>
-                      <m:e>
-                        <m:r>
-                          <w:rPr>
-                            <w:rFonts w:ascii="Cambria Math" w:hAnsi="Cambria Math"/>
-                            <w:color w:val="1A1A1A"/>
-                            <w:sz w:val="22"/>
-                          </w:rPr>
-                          <m:t xml:space="preserve">v</m:t>
-                        </m:r>
-                      </m:e>
-                      <m:sub>
-                        <m:r>
-                          <w:rPr>
-                            <w:rFonts w:ascii="Cambria Math" w:hAnsi="Cambria Math"/>
-                            <w:color w:val="1A1A1A"/>
-                            <w:sz w:val="22"/>
-                          </w:rPr>
-                          <m:t xml:space="preserve">1</m:t>
-                        </m:r>
-                      </m:sub>
-                    </m:sSub>
-                    <m:r>
-                      <w:rPr>
-                        <w:rFonts w:ascii="Cambria Math" w:hAnsi="Cambria Math"/>
-                        <w:color w:val="1A1A1A"/>
-                        <w:sz w:val="22"/>
-                      </w:rPr>
-                      <m:t xml:space="preserve"> - </m:t>
-                    </m:r>
-                    <m:sSub>
-                      <m:e>
-                        <m:r>
-                          <w:rPr>
-                            <w:rFonts w:ascii="Cambria Math" w:hAnsi="Cambria Math"/>
-                            <w:color w:val="1A1A1A"/>
-                            <w:sz w:val="22"/>
-                          </w:rPr>
-                          <m:t xml:space="preserve">v</m:t>
-                        </m:r>
-                      </m:e>
-                      <m:sub>
-                        <m:r>
-                          <w:rPr>
-                            <w:rFonts w:ascii="Cambria Math" w:hAnsi="Cambria Math"/>
-                            <w:color w:val="1A1A1A"/>
-                            <w:sz w:val="22"/>
-                          </w:rPr>
-                          <m:t xml:space="preserve">01</m:t>
-                        </m:r>
-                      </m:sub>
-                    </m:sSub>
-                  </m:num>
-                  <m:den>
-                    <m:sSub>
-                      <m:e>
-                        <m:r>
-                          <w:rPr>
-                            <w:rFonts w:ascii="Cambria Math" w:hAnsi="Cambria Math"/>
-                            <w:color w:val="1A1A1A"/>
-                            <w:sz w:val="22"/>
-                          </w:rPr>
-                          <m:t xml:space="preserve">a</m:t>
-                        </m:r>
-                      </m:e>
-                      <m:sub>
-                        <m:r>
-                          <w:rPr>
-                            <w:rFonts w:ascii="Cambria Math" w:hAnsi="Cambria Math"/>
-                            <w:color w:val="1A1A1A"/>
-                            <w:sz w:val="22"/>
-                          </w:rPr>
-                          <m:t xml:space="preserve">1</m:t>
-                        </m:r>
-                      </m:sub>
-                    </m:sSub>
-                  </m:den>
-                </m:f>
-              </m:oMath>
-            </m:oMathPara>
-          </w:p>
-        </w:tc>
-      </w:tr>
-    </w:tbl>
-    <w:p>
-      <w:pPr>
-        <w:keepNext/>
-        <w:spacing w:before="100" w:after="60" w:line="276" w:lineRule="auto"/>
-      </w:pPr>
-      <w:r>
-        <w:rPr>
-          <w:rFonts w:ascii="Calibri" w:hAnsi="Calibri"/>
-          <w:b/>
-          <w:i w:val="0"/>
-          <w:color w:val="1F3A5F"/>
-          <w:sz w:val="21"/>
-        </w:rPr>
-        <w:t xml:space="preserve">Case 1.  </w:t>
-      </w:r>
-      <w:r>
-        <w:rPr>
-          <w:rFonts w:ascii="Calibri" w:hAnsi="Calibri"/>
-          <w:b w:val="0"/>
-          <w:i w:val="0"/>
-          <w:color w:val="2B2B2B"/>
-          <w:sz w:val="21"/>
-        </w:rPr>
-        <w:t>Car 1 reaches +5.50 cm/s:</w:t>
-      </w:r>
-    </w:p>
-    <w:tbl>
-      <w:tblPr>
-        <w:jc w:val="left"/>
-        <w:tblLook w:firstColumn="1" w:firstRow="1" w:lastColumn="0" w:lastRow="0" w:noHBand="0" w:noVBand="1" w:val="04A0"/>
-        <w:tblW w:w="9400" w:type="dxa"/>
-        <w:tblLayout w:type="fixed"/>
-        <w:tblBorders>
-          <w:top w:val="nil"/>
-          <w:left w:val="nil"/>
-          <w:bottom w:val="nil"/>
-          <w:right w:val="nil"/>
-          <w:insideH w:val="nil"/>
-          <w:insideV w:val="nil"/>
-        </w:tblBorders>
-        <w:tblInd w:w="320" w:type="dxa"/>
-      </w:tblPr>
-      <w:tblGrid>
-        <w:gridCol w:w="320"/>
-        <w:gridCol w:w="9080"/>
-      </w:tblGrid>
-      <w:tr>
-        <w:tc>
-          <w:tcPr>
-            <w:tcW w:w="320" w:type="dxa"/>
-            <w:tcMar>
-              <w:top w:w="16" w:type="dxa"/>
-              <w:bottom w:w="16" w:type="dxa"/>
-              <w:start w:w="20" w:type="dxa"/>
-              <w:end w:w="72" w:type="dxa"/>
-              <w:left w:w="20" w:type="dxa"/>
-              <w:right w:w="72" w:type="dxa"/>
-            </w:tcMar>
-          </w:tcPr>
-          <w:p>
-            <w:pPr>
-              <w:spacing w:after="0" w:before="0"/>
-            </w:pPr>
-            <m:oMathPara>
-              <m:oMathParaPr>
-                <m:jc m:val="right"/>
-              </m:oMathParaPr>
-              <m:oMath>
-                <m:r>
-                  <w:rPr>
-                    <w:rFonts w:ascii="Cambria Math" w:hAnsi="Cambria Math"/>
-                    <w:color w:val="1A1A1A"/>
-                    <w:sz w:val="22"/>
-                  </w:rPr>
-                  <m:t xml:space="preserve">t</m:t>
-                </m:r>
-              </m:oMath>
-            </m:oMathPara>
-          </w:p>
-        </w:tc>
-        <w:tc>
-          <w:tcPr>
-            <w:tcW w:w="9080" w:type="dxa"/>
-            <w:tcMar>
-              <w:top w:w="16" w:type="dxa"/>
-              <w:bottom w:w="16" w:type="dxa"/>
-              <w:start w:w="72" w:type="dxa"/>
-              <w:end w:w="20" w:type="dxa"/>
-              <w:left w:w="72" w:type="dxa"/>
-              <w:right w:w="20" w:type="dxa"/>
-            </w:tcMar>
-          </w:tcPr>
-          <w:p>
-            <w:pPr>
-              <w:spacing w:after="0" w:before="0"/>
-            </w:pPr>
-            <m:oMathPara>
-              <m:oMathParaPr>
-                <m:jc m:val="left"/>
-              </m:oMathParaPr>
-              <m:oMath>
-                <m:r>
-                  <w:rPr>
-                    <w:rFonts w:ascii="Cambria Math" w:hAnsi="Cambria Math"/>
-                    <w:color w:val="1A1A1A"/>
-                    <w:sz w:val="22"/>
-                  </w:rPr>
-                  <m:t xml:space="preserve">= </m:t>
-                </m:r>
-                <m:f>
-                  <m:num>
-                    <m:r>
-                      <w:rPr>
-                        <w:rFonts w:ascii="Cambria Math" w:hAnsi="Cambria Math"/>
-                        <w:color w:val="1A1A1A"/>
-                        <w:sz w:val="22"/>
-                      </w:rPr>
-                      <m:t xml:space="preserve">5.50 - (-3.50)</m:t>
-                    </m:r>
-                  </m:num>
-                  <m:den>
-                    <m:r>
-                      <w:rPr>
-                        <w:rFonts w:ascii="Cambria Math" w:hAnsi="Cambria Math"/>
-                        <w:color w:val="1A1A1A"/>
-                        <w:sz w:val="22"/>
-                      </w:rPr>
-                      <m:t xml:space="preserve">2.40</m:t>
-                    </m:r>
-                  </m:den>
-                </m:f>
-              </m:oMath>
-            </m:oMathPara>
-          </w:p>
-        </w:tc>
-      </w:tr>
-      <w:tr>
-        <w:tc>
-          <w:tcPr>
-            <w:tcW w:w="320" w:type="dxa"/>
-            <w:tcMar>
-              <w:top w:w="16" w:type="dxa"/>
-              <w:bottom w:w="16" w:type="dxa"/>
-              <w:start w:w="20" w:type="dxa"/>
-              <w:end w:w="72" w:type="dxa"/>
-              <w:left w:w="20" w:type="dxa"/>
-              <w:right w:w="72" w:type="dxa"/>
-            </w:tcMar>
-          </w:tcPr>
-          <w:p>
-            <w:pPr>
-              <w:spacing w:after="0" w:before="0"/>
-            </w:pPr>
-          </w:p>
-        </w:tc>
-        <w:tc>
-          <w:tcPr>
-            <w:tcW w:w="9080" w:type="dxa"/>
+            <w:tcW w:w="7660" w:type="dxa"/>
             <w:tcMar>
               <w:top w:w="16" w:type="dxa"/>
               <w:bottom w:w="16" w:type="dxa"/>
@@ -9341,7 +10459,7 @@
       <w:tr>
         <w:tc>
           <w:tcPr>
-            <w:tcW w:w="320" w:type="dxa"/>
+            <w:tcW w:w="1740" w:type="dxa"/>
             <w:tcMar>
               <w:top w:w="16" w:type="dxa"/>
               <w:bottom w:w="16" w:type="dxa"/>
@@ -9355,11 +10473,26 @@
             <w:pPr>
               <w:spacing w:after="0" w:before="0"/>
             </w:pPr>
+            <m:oMathPara>
+              <m:oMathParaPr>
+                <m:jc m:val="right"/>
+              </m:oMathParaPr>
+              <m:oMath>
+                <m:r>
+                  <w:rPr>
+                    <w:rFonts w:ascii="Cambria Math" w:hAnsi="Cambria Math"/>
+                    <w:color w:val="1A1A1A"/>
+                    <w:sz w:val="22"/>
+                  </w:rPr>
+                  <m:t xml:space="preserve">t</m:t>
+                </m:r>
+              </m:oMath>
+            </m:oMathPara>
           </w:p>
         </w:tc>
         <w:tc>
           <w:tcPr>
-            <w:tcW w:w="9080" w:type="dxa"/>
+            <w:tcW w:w="7660" w:type="dxa"/>
             <w:tcMar>
               <w:top w:w="16" w:type="dxa"/>
               <w:bottom w:w="16" w:type="dxa"/>
@@ -9411,22 +10544,12 @@
       <w:r>
         <w:rPr>
           <w:rFonts w:ascii="Calibri" w:hAnsi="Calibri"/>
-          <w:b/>
-          <w:i w:val="0"/>
-          <w:color w:val="1F3A5F"/>
-          <w:sz w:val="21"/>
-        </w:rPr>
-        <w:t xml:space="preserve">Case 2.  </w:t>
-      </w:r>
-      <w:r>
-        <w:rPr>
-          <w:rFonts w:ascii="Calibri" w:hAnsi="Calibri"/>
           <w:b w:val="0"/>
           <w:i w:val="0"/>
           <w:color w:val="2B2B2B"/>
           <w:sz w:val="21"/>
         </w:rPr>
-        <w:t>Car 1 reaches -5.50 cm/s:</w:t>
+        <w:t>Solving Case 2 (velocities are in opposite directions, but the same speed):</w:t>
       </w:r>
     </w:p>
     <w:tbl>
@@ -9446,13 +10569,217 @@
         <w:tblInd w:w="320" w:type="dxa"/>
       </w:tblPr>
       <w:tblGrid>
-        <w:gridCol w:w="320"/>
-        <w:gridCol w:w="9080"/>
+        <w:gridCol w:w="1740"/>
+        <w:gridCol w:w="7660"/>
       </w:tblGrid>
       <w:tr>
         <w:tc>
           <w:tcPr>
-            <w:tcW w:w="320" w:type="dxa"/>
+            <w:tcW w:w="1740" w:type="dxa"/>
+            <w:tcMar>
+              <w:top w:w="16" w:type="dxa"/>
+              <w:bottom w:w="16" w:type="dxa"/>
+              <w:start w:w="20" w:type="dxa"/>
+              <w:end w:w="72" w:type="dxa"/>
+              <w:left w:w="20" w:type="dxa"/>
+              <w:right w:w="72" w:type="dxa"/>
+            </w:tcMar>
+          </w:tcPr>
+          <w:p>
+            <w:pPr>
+              <w:spacing w:after="0" w:before="0"/>
+            </w:pPr>
+            <m:oMathPara>
+              <m:oMathParaPr>
+                <m:jc m:val="right"/>
+              </m:oMathParaPr>
+              <m:oMath>
+                <m:r>
+                  <w:rPr>
+                    <w:rFonts w:ascii="Cambria Math" w:hAnsi="Cambria Math"/>
+                    <w:color w:val="1A1A1A"/>
+                    <w:sz w:val="22"/>
+                  </w:rPr>
+                  <m:t xml:space="preserve">-3.50 + 2.40t</m:t>
+                </m:r>
+              </m:oMath>
+            </m:oMathPara>
+          </w:p>
+        </w:tc>
+        <w:tc>
+          <w:tcPr>
+            <w:tcW w:w="7660" w:type="dxa"/>
+            <w:tcMar>
+              <w:top w:w="16" w:type="dxa"/>
+              <w:bottom w:w="16" w:type="dxa"/>
+              <w:start w:w="72" w:type="dxa"/>
+              <w:end w:w="20" w:type="dxa"/>
+              <w:left w:w="72" w:type="dxa"/>
+              <w:right w:w="20" w:type="dxa"/>
+            </w:tcMar>
+          </w:tcPr>
+          <w:p>
+            <w:pPr>
+              <w:spacing w:after="0" w:before="0"/>
+            </w:pPr>
+            <m:oMathPara>
+              <m:oMathParaPr>
+                <m:jc m:val="left"/>
+              </m:oMathParaPr>
+              <m:oMath>
+                <m:r>
+                  <w:rPr>
+                    <w:rFonts w:ascii="Cambria Math" w:hAnsi="Cambria Math"/>
+                    <w:color w:val="1A1A1A"/>
+                    <w:sz w:val="22"/>
+                  </w:rPr>
+                  <m:t xml:space="preserve">= -5.50</m:t>
+                </m:r>
+              </m:oMath>
+            </m:oMathPara>
+          </w:p>
+        </w:tc>
+      </w:tr>
+      <w:tr>
+        <w:tc>
+          <w:tcPr>
+            <w:tcW w:w="1740" w:type="dxa"/>
+            <w:tcMar>
+              <w:top w:w="16" w:type="dxa"/>
+              <w:bottom w:w="16" w:type="dxa"/>
+              <w:start w:w="20" w:type="dxa"/>
+              <w:end w:w="72" w:type="dxa"/>
+              <w:left w:w="20" w:type="dxa"/>
+              <w:right w:w="72" w:type="dxa"/>
+            </w:tcMar>
+          </w:tcPr>
+          <w:p>
+            <w:pPr>
+              <w:spacing w:after="0" w:before="0"/>
+            </w:pPr>
+            <m:oMathPara>
+              <m:oMathParaPr>
+                <m:jc m:val="right"/>
+              </m:oMathParaPr>
+              <m:oMath>
+                <m:r>
+                  <w:rPr>
+                    <w:rFonts w:ascii="Cambria Math" w:hAnsi="Cambria Math"/>
+                    <w:color w:val="1A1A1A"/>
+                    <w:sz w:val="22"/>
+                  </w:rPr>
+                  <m:t xml:space="preserve">2.40t</m:t>
+                </m:r>
+              </m:oMath>
+            </m:oMathPara>
+          </w:p>
+        </w:tc>
+        <w:tc>
+          <w:tcPr>
+            <w:tcW w:w="7660" w:type="dxa"/>
+            <w:tcMar>
+              <w:top w:w="16" w:type="dxa"/>
+              <w:bottom w:w="16" w:type="dxa"/>
+              <w:start w:w="72" w:type="dxa"/>
+              <w:end w:w="20" w:type="dxa"/>
+              <w:left w:w="72" w:type="dxa"/>
+              <w:right w:w="20" w:type="dxa"/>
+            </w:tcMar>
+          </w:tcPr>
+          <w:p>
+            <w:pPr>
+              <w:spacing w:after="0" w:before="0"/>
+            </w:pPr>
+            <m:oMathPara>
+              <m:oMathParaPr>
+                <m:jc m:val="left"/>
+              </m:oMathParaPr>
+              <m:oMath>
+                <m:r>
+                  <w:rPr>
+                    <w:rFonts w:ascii="Cambria Math" w:hAnsi="Cambria Math"/>
+                    <w:color w:val="1A1A1A"/>
+                    <w:sz w:val="22"/>
+                  </w:rPr>
+                  <m:t xml:space="preserve">= -5.50 + 3.50</m:t>
+                </m:r>
+              </m:oMath>
+            </m:oMathPara>
+          </w:p>
+        </w:tc>
+      </w:tr>
+      <w:tr>
+        <w:tc>
+          <w:tcPr>
+            <w:tcW w:w="1740" w:type="dxa"/>
+            <w:tcMar>
+              <w:top w:w="16" w:type="dxa"/>
+              <w:bottom w:w="16" w:type="dxa"/>
+              <w:start w:w="20" w:type="dxa"/>
+              <w:end w:w="72" w:type="dxa"/>
+              <w:left w:w="20" w:type="dxa"/>
+              <w:right w:w="72" w:type="dxa"/>
+            </w:tcMar>
+          </w:tcPr>
+          <w:p>
+            <w:pPr>
+              <w:spacing w:after="0" w:before="0"/>
+            </w:pPr>
+            <m:oMathPara>
+              <m:oMathParaPr>
+                <m:jc m:val="right"/>
+              </m:oMathParaPr>
+              <m:oMath>
+                <m:r>
+                  <w:rPr>
+                    <w:rFonts w:ascii="Cambria Math" w:hAnsi="Cambria Math"/>
+                    <w:color w:val="1A1A1A"/>
+                    <w:sz w:val="22"/>
+                  </w:rPr>
+                  <m:t xml:space="preserve">2.40t</m:t>
+                </m:r>
+              </m:oMath>
+            </m:oMathPara>
+          </w:p>
+        </w:tc>
+        <w:tc>
+          <w:tcPr>
+            <w:tcW w:w="7660" w:type="dxa"/>
+            <w:tcMar>
+              <w:top w:w="16" w:type="dxa"/>
+              <w:bottom w:w="16" w:type="dxa"/>
+              <w:start w:w="72" w:type="dxa"/>
+              <w:end w:w="20" w:type="dxa"/>
+              <w:left w:w="72" w:type="dxa"/>
+              <w:right w:w="20" w:type="dxa"/>
+            </w:tcMar>
+          </w:tcPr>
+          <w:p>
+            <w:pPr>
+              <w:spacing w:after="0" w:before="0"/>
+            </w:pPr>
+            <m:oMathPara>
+              <m:oMathParaPr>
+                <m:jc m:val="left"/>
+              </m:oMathParaPr>
+              <m:oMath>
+                <m:r>
+                  <w:rPr>
+                    <w:rFonts w:ascii="Cambria Math" w:hAnsi="Cambria Math"/>
+                    <w:color w:val="1A1A1A"/>
+                    <w:sz w:val="22"/>
+                  </w:rPr>
+                  <m:t xml:space="preserve">= -2.00</m:t>
+                </m:r>
+              </m:oMath>
+            </m:oMathPara>
+          </w:p>
+        </w:tc>
+      </w:tr>
+      <w:tr>
+        <w:tc>
+          <w:tcPr>
+            <w:tcW w:w="1740" w:type="dxa"/>
             <w:tcMar>
               <w:top w:w="16" w:type="dxa"/>
               <w:bottom w:w="16" w:type="dxa"/>
@@ -9485,82 +10812,7 @@
         </w:tc>
         <w:tc>
           <w:tcPr>
-            <w:tcW w:w="9080" w:type="dxa"/>
-            <w:tcMar>
-              <w:top w:w="16" w:type="dxa"/>
-              <w:bottom w:w="16" w:type="dxa"/>
-              <w:start w:w="72" w:type="dxa"/>
-              <w:end w:w="20" w:type="dxa"/>
-              <w:left w:w="72" w:type="dxa"/>
-              <w:right w:w="20" w:type="dxa"/>
-            </w:tcMar>
-          </w:tcPr>
-          <w:p>
-            <w:pPr>
-              <w:spacing w:after="0" w:before="0"/>
-            </w:pPr>
-            <m:oMathPara>
-              <m:oMathParaPr>
-                <m:jc m:val="left"/>
-              </m:oMathParaPr>
-              <m:oMath>
-                <m:r>
-                  <w:rPr>
-                    <w:rFonts w:ascii="Cambria Math" w:hAnsi="Cambria Math"/>
-                    <w:color w:val="1A1A1A"/>
-                    <w:sz w:val="22"/>
-                  </w:rPr>
-                  <m:t xml:space="preserve">= </m:t>
-                </m:r>
-                <m:f>
-                  <m:num>
-                    <m:r>
-                      <w:rPr>
-                        <w:rFonts w:ascii="Cambria Math" w:hAnsi="Cambria Math"/>
-                        <w:color w:val="1A1A1A"/>
-                        <w:sz w:val="22"/>
-                      </w:rPr>
-                      <m:t xml:space="preserve">-5.50 - (-3.50)</m:t>
-                    </m:r>
-                  </m:num>
-                  <m:den>
-                    <m:r>
-                      <w:rPr>
-                        <w:rFonts w:ascii="Cambria Math" w:hAnsi="Cambria Math"/>
-                        <w:color w:val="1A1A1A"/>
-                        <w:sz w:val="22"/>
-                      </w:rPr>
-                      <m:t xml:space="preserve">2.40</m:t>
-                    </m:r>
-                  </m:den>
-                </m:f>
-              </m:oMath>
-            </m:oMathPara>
-          </w:p>
-        </w:tc>
-      </w:tr>
-      <w:tr>
-        <w:tc>
-          <w:tcPr>
-            <w:tcW w:w="320" w:type="dxa"/>
-            <w:tcMar>
-              <w:top w:w="16" w:type="dxa"/>
-              <w:bottom w:w="16" w:type="dxa"/>
-              <w:start w:w="20" w:type="dxa"/>
-              <w:end w:w="72" w:type="dxa"/>
-              <w:left w:w="20" w:type="dxa"/>
-              <w:right w:w="72" w:type="dxa"/>
-            </w:tcMar>
-          </w:tcPr>
-          <w:p>
-            <w:pPr>
-              <w:spacing w:after="0" w:before="0"/>
-            </w:pPr>
-          </w:p>
-        </w:tc>
-        <w:tc>
-          <w:tcPr>
-            <w:tcW w:w="9080" w:type="dxa"/>
+            <w:tcW w:w="7660" w:type="dxa"/>
             <w:tcMar>
               <w:top w:w="16" w:type="dxa"/>
               <w:bottom w:w="16" w:type="dxa"/>
@@ -9617,7 +10869,7 @@
       <w:tr>
         <w:tc>
           <w:tcPr>
-            <w:tcW w:w="320" w:type="dxa"/>
+            <w:tcW w:w="1740" w:type="dxa"/>
             <w:tcMar>
               <w:top w:w="16" w:type="dxa"/>
               <w:bottom w:w="16" w:type="dxa"/>
@@ -9631,11 +10883,26 @@
             <w:pPr>
               <w:spacing w:after="0" w:before="0"/>
             </w:pPr>
+            <m:oMathPara>
+              <m:oMathParaPr>
+                <m:jc m:val="right"/>
+              </m:oMathParaPr>
+              <m:oMath>
+                <m:r>
+                  <w:rPr>
+                    <w:rFonts w:ascii="Cambria Math" w:hAnsi="Cambria Math"/>
+                    <w:color w:val="1A1A1A"/>
+                    <w:sz w:val="22"/>
+                  </w:rPr>
+                  <m:t xml:space="preserve">t</m:t>
+                </m:r>
+              </m:oMath>
+            </m:oMathPara>
           </w:p>
         </w:tc>
         <w:tc>
           <w:tcPr>
-            <w:tcW w:w="9080" w:type="dxa"/>
+            <w:tcW w:w="7660" w:type="dxa"/>
             <w:tcMar>
               <w:top w:w="16" w:type="dxa"/>
               <w:bottom w:w="16" w:type="dxa"/>
@@ -9671,7 +10938,7 @@
                     <w:color w:val="444444"/>
                     <w:sz w:val="22"/>
                   </w:rPr>
-                  <m:t xml:space="preserve">  s   (rejected: t &lt; 0)</m:t>
+                  <m:t xml:space="preserve">  s   (discarded: time cannot be negative)</m:t>
                 </m:r>
               </m:oMath>
             </m:oMathPara>
@@ -9791,7 +11058,7 @@
           <w:color w:val="1F3A5F"/>
           <w:sz w:val="21"/>
         </w:rPr>
-        <w:t xml:space="preserve">Part (b).  </w:t>
+        <w:t xml:space="preserve">Step 5.  </w:t>
       </w:r>
       <w:r>
         <w:rPr>
@@ -9801,9 +11068,245 @@
           <w:color w:val="2B2B2B"/>
           <w:sz w:val="21"/>
         </w:rPr>
-        <w:t>Car 2's speed never changes, so the matched speed is simply its constant value:</w:t>
+        <w:t>Determine their speeds at this time.</w:t>
       </w:r>
     </w:p>
+    <w:p>
+      <w:pPr>
+        <w:keepNext/>
+        <w:spacing w:before="100" w:after="60" w:line="276" w:lineRule="auto"/>
+      </w:pPr>
+      <w:r>
+        <w:rPr>
+          <w:rFonts w:ascii="Calibri" w:hAnsi="Calibri"/>
+          <w:b w:val="0"/>
+          <w:i w:val="0"/>
+          <w:color w:val="2B2B2B"/>
+          <w:sz w:val="21"/>
+        </w:rPr>
+        <w:t>Since we forced Car 1's speed to match Car 2's constant 5.50 cm/s, we already know the answer. Verifying by substituting t = 3.75 s into Car 1's velocity equation:</w:t>
+      </w:r>
+    </w:p>
+    <w:tbl>
+      <w:tblPr>
+        <w:jc w:val="left"/>
+        <w:tblLook w:firstColumn="1" w:firstRow="1" w:lastColumn="0" w:lastRow="0" w:noHBand="0" w:noVBand="1" w:val="04A0"/>
+        <w:tblW w:w="9400" w:type="dxa"/>
+        <w:tblLayout w:type="fixed"/>
+        <w:tblBorders>
+          <w:top w:val="nil"/>
+          <w:left w:val="nil"/>
+          <w:bottom w:val="nil"/>
+          <w:right w:val="nil"/>
+          <w:insideH w:val="nil"/>
+          <w:insideV w:val="nil"/>
+        </w:tblBorders>
+        <w:tblInd w:w="320" w:type="dxa"/>
+      </w:tblPr>
+      <w:tblGrid>
+        <w:gridCol w:w="420"/>
+        <w:gridCol w:w="8980"/>
+      </w:tblGrid>
+      <w:tr>
+        <w:tc>
+          <w:tcPr>
+            <w:tcW w:w="420" w:type="dxa"/>
+            <w:tcMar>
+              <w:top w:w="16" w:type="dxa"/>
+              <w:bottom w:w="16" w:type="dxa"/>
+              <w:start w:w="20" w:type="dxa"/>
+              <w:end w:w="72" w:type="dxa"/>
+              <w:left w:w="20" w:type="dxa"/>
+              <w:right w:w="72" w:type="dxa"/>
+            </w:tcMar>
+          </w:tcPr>
+          <w:p>
+            <w:pPr>
+              <w:spacing w:after="0" w:before="0"/>
+            </w:pPr>
+            <m:oMathPara>
+              <m:oMathParaPr>
+                <m:jc m:val="right"/>
+              </m:oMathParaPr>
+              <m:oMath>
+                <m:sSub>
+                  <m:e>
+                    <m:r>
+                      <w:rPr>
+                        <w:rFonts w:ascii="Cambria Math" w:hAnsi="Cambria Math"/>
+                        <w:color w:val="1A1A1A"/>
+                        <w:sz w:val="22"/>
+                      </w:rPr>
+                      <m:t xml:space="preserve">v</m:t>
+                    </m:r>
+                  </m:e>
+                  <m:sub>
+                    <m:r>
+                      <w:rPr>
+                        <w:rFonts w:ascii="Cambria Math" w:hAnsi="Cambria Math"/>
+                        <w:color w:val="1A1A1A"/>
+                        <w:sz w:val="22"/>
+                      </w:rPr>
+                      <m:t xml:space="preserve">1</m:t>
+                    </m:r>
+                  </m:sub>
+                </m:sSub>
+              </m:oMath>
+            </m:oMathPara>
+          </w:p>
+        </w:tc>
+        <w:tc>
+          <w:tcPr>
+            <w:tcW w:w="8980" w:type="dxa"/>
+            <w:tcMar>
+              <w:top w:w="16" w:type="dxa"/>
+              <w:bottom w:w="16" w:type="dxa"/>
+              <w:start w:w="72" w:type="dxa"/>
+              <w:end w:w="20" w:type="dxa"/>
+              <w:left w:w="72" w:type="dxa"/>
+              <w:right w:w="20" w:type="dxa"/>
+            </w:tcMar>
+          </w:tcPr>
+          <w:p>
+            <w:pPr>
+              <w:spacing w:after="0" w:before="0"/>
+            </w:pPr>
+            <m:oMathPara>
+              <m:oMathParaPr>
+                <m:jc m:val="left"/>
+              </m:oMathParaPr>
+              <m:oMath>
+                <m:r>
+                  <w:rPr>
+                    <w:rFonts w:ascii="Cambria Math" w:hAnsi="Cambria Math"/>
+                    <w:color w:val="1A1A1A"/>
+                    <w:sz w:val="22"/>
+                  </w:rPr>
+                  <m:t xml:space="preserve">= -3.50 + 2.40(3.75)</m:t>
+                </m:r>
+              </m:oMath>
+            </m:oMathPara>
+          </w:p>
+        </w:tc>
+      </w:tr>
+      <w:tr>
+        <w:tc>
+          <w:tcPr>
+            <w:tcW w:w="420" w:type="dxa"/>
+            <w:tcMar>
+              <w:top w:w="16" w:type="dxa"/>
+              <w:bottom w:w="16" w:type="dxa"/>
+              <w:start w:w="20" w:type="dxa"/>
+              <w:end w:w="72" w:type="dxa"/>
+              <w:left w:w="20" w:type="dxa"/>
+              <w:right w:w="72" w:type="dxa"/>
+            </w:tcMar>
+          </w:tcPr>
+          <w:p>
+            <w:pPr>
+              <w:spacing w:after="0" w:before="0"/>
+            </w:pPr>
+          </w:p>
+        </w:tc>
+        <w:tc>
+          <w:tcPr>
+            <w:tcW w:w="8980" w:type="dxa"/>
+            <w:tcMar>
+              <w:top w:w="16" w:type="dxa"/>
+              <w:bottom w:w="16" w:type="dxa"/>
+              <w:start w:w="72" w:type="dxa"/>
+              <w:end w:w="20" w:type="dxa"/>
+              <w:left w:w="72" w:type="dxa"/>
+              <w:right w:w="20" w:type="dxa"/>
+            </w:tcMar>
+          </w:tcPr>
+          <w:p>
+            <w:pPr>
+              <w:spacing w:after="0" w:before="0"/>
+            </w:pPr>
+            <m:oMathPara>
+              <m:oMathParaPr>
+                <m:jc m:val="left"/>
+              </m:oMathParaPr>
+              <m:oMath>
+                <m:r>
+                  <w:rPr>
+                    <w:rFonts w:ascii="Cambria Math" w:hAnsi="Cambria Math"/>
+                    <w:color w:val="1A1A1A"/>
+                    <w:sz w:val="22"/>
+                  </w:rPr>
+                  <m:t xml:space="preserve">= -3.50 + 9.00</m:t>
+                </m:r>
+              </m:oMath>
+            </m:oMathPara>
+          </w:p>
+        </w:tc>
+      </w:tr>
+      <w:tr>
+        <w:tc>
+          <w:tcPr>
+            <w:tcW w:w="420" w:type="dxa"/>
+            <w:tcMar>
+              <w:top w:w="16" w:type="dxa"/>
+              <w:bottom w:w="16" w:type="dxa"/>
+              <w:start w:w="20" w:type="dxa"/>
+              <w:end w:w="72" w:type="dxa"/>
+              <w:left w:w="20" w:type="dxa"/>
+              <w:right w:w="72" w:type="dxa"/>
+            </w:tcMar>
+          </w:tcPr>
+          <w:p>
+            <w:pPr>
+              <w:spacing w:after="0" w:before="0"/>
+            </w:pPr>
+          </w:p>
+        </w:tc>
+        <w:tc>
+          <w:tcPr>
+            <w:tcW w:w="8980" w:type="dxa"/>
+            <w:tcMar>
+              <w:top w:w="16" w:type="dxa"/>
+              <w:bottom w:w="16" w:type="dxa"/>
+              <w:start w:w="72" w:type="dxa"/>
+              <w:end w:w="20" w:type="dxa"/>
+              <w:left w:w="72" w:type="dxa"/>
+              <w:right w:w="20" w:type="dxa"/>
+            </w:tcMar>
+          </w:tcPr>
+          <w:p>
+            <w:pPr>
+              <w:spacing w:after="0" w:before="0"/>
+            </w:pPr>
+            <m:oMathPara>
+              <m:oMathParaPr>
+                <m:jc m:val="left"/>
+              </m:oMathParaPr>
+              <m:oMath>
+                <m:r>
+                  <w:rPr>
+                    <w:rFonts w:ascii="Cambria Math" w:hAnsi="Cambria Math"/>
+                    <w:color w:val="1A1A1A"/>
+                    <w:sz w:val="22"/>
+                  </w:rPr>
+                  <m:t xml:space="preserve">= 5.50</m:t>
+                </m:r>
+                <m:r>
+                  <m:rPr>
+                    <m:nor/>
+                  </m:rPr>
+                  <w:rPr>
+                    <w:rFonts w:ascii="Cambria Math" w:hAnsi="Cambria Math"/>
+                    <w:color w:val="444444"/>
+                    <w:sz w:val="22"/>
+                  </w:rPr>
+                  <m:t xml:space="preserve">  cm/s</m:t>
+                </m:r>
+              </m:oMath>
+            </m:oMathPara>
+          </w:p>
+        </w:tc>
+      </w:tr>
+    </w:tbl>
     <w:tbl>
       <w:tblPr>
         <w:jc w:val="center"/>
@@ -9875,6 +11378,16 @@
             <w:pPr>
               <w:spacing w:before="0" w:after="0"/>
             </w:pPr>
+            <w:r>
+              <w:rPr>
+                <w:rFonts w:ascii="Calibri" w:hAnsi="Calibri"/>
+                <w:b/>
+                <w:i w:val="0"/>
+                <w:color w:val="1F3A5F"/>
+                <w:sz w:val="26"/>
+              </w:rPr>
+              <w:t xml:space="preserve">Speed = </w:t>
+            </w:r>
             <m:oMath>
               <m:r>
                 <m:rPr>
@@ -9886,7 +11399,7 @@
                   <w:color w:val="1F3A5F"/>
                   <w:sz w:val="26"/>
                 </w:rPr>
-                <m:t xml:space="preserve">|v| = 5.50</m:t>
+                <m:t xml:space="preserve">5.50</m:t>
               </m:r>
             </m:oMath>
             <w:r>
@@ -9981,7 +11494,7 @@
                 <w:color w:val="404040"/>
                 <w:sz w:val="20"/>
               </w:rPr>
-              <w:t>Isolating t first lets us test both the +5.50 and -5.50 cases by swapping a single number, with no need to re-balance the whole equation twice.</w:t>
+              <w:t>This problem shows the difference between speed and velocity. Car 1 actually starts by rolling backward at 3.50 cm/s; its positive acceleration slows it down, brings it momentarily to rest, then speeds it up forward until its forward speed matches Car 2's constant cruising speed. Checking both cases with the absolute value keeps us from missing the correct physical reality.</w:t>
             </w:r>
           </w:p>
         </w:tc>
@@ -10537,7 +12050,27 @@
                 <w:color w:val="333333"/>
                 <w:sz w:val="21"/>
               </w:rPr>
-              <w:t>Time t for the trooper to overtake the car</w:t>
+              <w:t xml:space="preserve">Time </w:t>
+            </w:r>
+            <m:oMath>
+              <m:r>
+                <w:rPr>
+                  <w:rFonts w:ascii="Cambria Math" w:hAnsi="Cambria Math"/>
+                  <w:color w:val="333333"/>
+                  <w:sz w:val="21"/>
+                </w:rPr>
+                <m:t xml:space="preserve">t</m:t>
+              </m:r>
+            </m:oMath>
+            <w:r>
+              <w:rPr>
+                <w:rFonts w:ascii="Calibri" w:hAnsi="Calibri"/>
+                <w:b w:val="0"/>
+                <w:i w:val="0"/>
+                <w:color w:val="333333"/>
+                <w:sz w:val="21"/>
+              </w:rPr>
+              <w:t xml:space="preserve"> for the trooper to overtake the car</w:t>
             </w:r>
           </w:p>
         </w:tc>

</xml_diff>